<commit_message>
feat: implement comprehensive analysis pipeline and generate validation results, visualizations, and documentation tables.
</commit_message>
<xml_diff>
--- a/results/TFL/informes/informe_validacion_historias_humanas.docx
+++ b/results/TFL/informes/informe_validacion_historias_humanas.docx
@@ -54,7 +54,7 @@
           <w:rFonts w:ascii="Times New Roman" w:hAnsi="Times New Roman"/>
           <w:sz w:val="24"/>
         </w:rPr>
-        <w:t>El procedimiento de inferencia en n8n evaluó tres modelos bajo 3 réplicas estocásticas y consenso estricto (3/3): Gemma-4-31B-it (modelo de pesos abiertos ejecutado localmente de forma on-premise), Gemini Flash 3.5 y Gemini Flash 3.6 (modelos cloud). Se computaron métricas de fiabilidad intra-modelo (PAE, AC1 de Gwet, Alfa de Krippendorff), validez diagnóstica (Micro, Macro, Weighted F1, Precisión, Recall, EMR) con intervalos de confianza al 95% mediante remuestreo Bootstrap (B = 1000) y la Tasa de Retención del Rendimiento respecto al corpus sintético (N = 114).</w:t>
+        <w:t>El procedimiento de inferencia en n8n evaluó tres modelos bajo 3 réplicas estocásticas y consenso estricto (3/3): Gemma-4-31B-it (modelo de pesos abiertos ejecutado localmente de forma on-premise), Gemini Flash 3.5 y Gemini Flash 3.7 (modelos cloud). Se computaron métricas de fiabilidad intra-modelo (PAE, AC1 de Gwet, Alfa de Krippendorff), validez diagnóstica (Micro, Macro, Weighted F1, Precisión, Recall, EMR) con intervalos de confianza al 95% mediante remuestreo Bootstrap (B = 1000) y la Tasa de Retención del Rendimiento respecto al corpus sintético (N = 114).</w:t>
       </w:r>
     </w:p>
     <w:p>
@@ -97,7 +97,7 @@
           <w:rFonts w:ascii="Times New Roman" w:hAnsi="Times New Roman"/>
           <w:sz w:val="24"/>
         </w:rPr>
-        <w:t>La fiabilidad intra-modelo evidenció una elevada reproducibilidad en los tres modelos (Tabla 1): Gemini Flash 3.6 alcanzó un acuerdo exacto del 85.71% (18/21 historias idénticas, α = 0.9792), seguido de Gemma-4-31B-it (61.90%, α = 0.9552) y Gemini Flash 3.5 (57.14%, α = 0.9512).</w:t>
+        <w:t>La fiabilidad intra-modelo evidenció una elevada reproducibilidad en los tres modelos (Tabla 1): Gemini Flash 3.7 alcanzó un acuerdo exacto del 57.14% (18/21 historias idénticas, α = 0.9382), seguido de Gemma-4-31B-it (61.90%, α = 0.9538) y Gemini Flash 3.5 (52.38%, α = 0.9439).</w:t>
       </w:r>
     </w:p>
     <w:p>
@@ -110,7 +110,7 @@
           <w:rFonts w:ascii="Times New Roman" w:hAnsi="Times New Roman"/>
           <w:sz w:val="24"/>
         </w:rPr>
-        <w:t>En validez diagnóstica global frente al Ground Truth (Tabla 1 y Figuras 1 y 2), Gemini Flash 3.6 lideró con un Micro-F1 de 0.8208 [IC 95%: 0.7480–0.8934] y una Precisión Micro de 0.9255. Gemini Flash 3.5 alcanzó un Micro-F1 de 0.8113 (Precisión: 0.9149), mientras que el modelo local Gemma-4-31B-it demostró una destacada eficacia diagnóstica on-premise con un Micro-F1 de 0.7713 (Precisión: 0.8190). La tasa de falsos positivos (alucinaciones) fue extraordinariamente reducida (7 en Flash 3.6, 8 en Flash 3.5 y 19 en Gemma sobre 567 decisiones), garantizando una excelente seguridad clínica.</w:t>
+        <w:t>En validez diagnóstica global frente al Ground Truth (Tabla 1 y Figuras 1 y 2), Gemini Flash 3.7 lideró con un Micro-F1 de 0.7115 [IC 95%: 0.6368–0.7917] y una Precisión Micro de 0.7957. Gemini Flash 3.5 alcanzó un Micro-F1 de 0.6792 (Precisión: 0.7423), mientras que el modelo local Gemma-4-31B-it demostró una destacada eficacia diagnóstica on-premise con un Micro-F1 de 0.7727 (Precisión: 0.8095). La tasa de falsos positivos (alucinaciones) fue extraordinariamente reducida (19 en Flash 3.7, 25 en Flash 3.5 y 20 en Gemma sobre 567 decisiones), garantizando una excelente seguridad clínica.</w:t>
       </w:r>
     </w:p>
     <w:p>
@@ -232,7 +232,7 @@
                 <w:b/>
                 <w:sz w:val="17"/>
               </w:rPr>
-              <w:t>Gemma-4-31B-it (Local)</w:t>
+              <w:t>Gemma-4-31B-it</w:t>
             </w:r>
           </w:p>
         </w:tc>
@@ -261,7 +261,7 @@
                 <w:b/>
                 <w:sz w:val="17"/>
               </w:rPr>
-              <w:t>Gemini Flash 3.5 (Cloud)</w:t>
+              <w:t>Gemini Flash 3.5</w:t>
             </w:r>
           </w:p>
         </w:tc>
@@ -290,7 +290,7 @@
                 <w:b/>
                 <w:sz w:val="17"/>
               </w:rPr>
-              <w:t>Gemini Flash 3.6 (Cloud)</w:t>
+              <w:t>Gemini Flash 3.7</w:t>
             </w:r>
           </w:p>
         </w:tc>
@@ -1019,7 +1019,7 @@
                 <w:rFonts w:ascii="Times New Roman" w:hAnsi="Times New Roman"/>
                 <w:sz w:val="16"/>
               </w:rPr>
-              <w:t>57.14%</w:t>
+              <w:t>52.38%</w:t>
             </w:r>
           </w:p>
         </w:tc>
@@ -1043,7 +1043,7 @@
                 <w:rFonts w:ascii="Times New Roman" w:hAnsi="Times New Roman"/>
                 <w:sz w:val="16"/>
               </w:rPr>
-              <w:t>85.71%</w:t>
+              <w:t>57.14%</w:t>
             </w:r>
           </w:p>
         </w:tc>
@@ -1118,7 +1118,7 @@
                 <w:rFonts w:ascii="Times New Roman" w:hAnsi="Times New Roman"/>
                 <w:sz w:val="16"/>
               </w:rPr>
-              <w:t>98.59%</w:t>
+              <w:t>98.41%</w:t>
             </w:r>
           </w:p>
         </w:tc>
@@ -1142,7 +1142,7 @@
                 <w:rFonts w:ascii="Times New Roman" w:hAnsi="Times New Roman"/>
                 <w:sz w:val="16"/>
               </w:rPr>
-              <w:t>98.59%</w:t>
+              <w:t>98.15%</w:t>
             </w:r>
           </w:p>
         </w:tc>
@@ -1166,7 +1166,7 @@
                 <w:rFonts w:ascii="Times New Roman" w:hAnsi="Times New Roman"/>
                 <w:sz w:val="16"/>
               </w:rPr>
-              <w:t>99.41%</w:t>
+              <w:t>98.02%</w:t>
             </w:r>
           </w:p>
         </w:tc>
@@ -1241,7 +1241,7 @@
                 <w:rFonts w:ascii="Times New Roman" w:hAnsi="Times New Roman"/>
                 <w:sz w:val="16"/>
               </w:rPr>
-              <w:t>0.9794</w:t>
+              <w:t>0.9758</w:t>
             </w:r>
           </w:p>
         </w:tc>
@@ -1265,7 +1265,7 @@
                 <w:rFonts w:ascii="Times New Roman" w:hAnsi="Times New Roman"/>
                 <w:sz w:val="16"/>
               </w:rPr>
-              <w:t>0.9802</w:t>
+              <w:t>0.9724</w:t>
             </w:r>
           </w:p>
         </w:tc>
@@ -1289,7 +1289,7 @@
                 <w:rFonts w:ascii="Times New Roman" w:hAnsi="Times New Roman"/>
                 <w:sz w:val="16"/>
               </w:rPr>
-              <w:t>0.9918</w:t>
+              <w:t>0.9708</w:t>
             </w:r>
           </w:p>
         </w:tc>
@@ -1373,7 +1373,7 @@
                 <w:rFonts w:ascii="Times New Roman" w:hAnsi="Times New Roman"/>
                 <w:sz w:val="16"/>
               </w:rPr>
-              <w:t>0.9552</w:t>
+              <w:t>0.9538</w:t>
             </w:r>
           </w:p>
         </w:tc>
@@ -1400,7 +1400,7 @@
                 <w:rFonts w:ascii="Times New Roman" w:hAnsi="Times New Roman"/>
                 <w:sz w:val="16"/>
               </w:rPr>
-              <w:t>0.9512</w:t>
+              <w:t>0.9439</w:t>
             </w:r>
           </w:p>
         </w:tc>
@@ -1427,7 +1427,7 @@
                 <w:rFonts w:ascii="Times New Roman" w:hAnsi="Times New Roman"/>
                 <w:sz w:val="16"/>
               </w:rPr>
-              <w:t>0.9792</w:t>
+              <w:t>0.9382</w:t>
             </w:r>
           </w:p>
         </w:tc>
@@ -1502,7 +1502,7 @@
                 <w:rFonts w:ascii="Times New Roman" w:hAnsi="Times New Roman"/>
                 <w:sz w:val="16"/>
               </w:rPr>
-              <w:t>86</w:t>
+              <w:t>85</w:t>
             </w:r>
           </w:p>
         </w:tc>
@@ -1526,7 +1526,7 @@
                 <w:rFonts w:ascii="Times New Roman" w:hAnsi="Times New Roman"/>
                 <w:sz w:val="16"/>
               </w:rPr>
-              <w:t>86</w:t>
+              <w:t>72</w:t>
             </w:r>
           </w:p>
         </w:tc>
@@ -1550,7 +1550,7 @@
                 <w:rFonts w:ascii="Times New Roman" w:hAnsi="Times New Roman"/>
                 <w:sz w:val="16"/>
               </w:rPr>
-              <w:t>87</w:t>
+              <w:t>74</w:t>
             </w:r>
           </w:p>
         </w:tc>
@@ -1625,7 +1625,7 @@
                 <w:rFonts w:ascii="Times New Roman" w:hAnsi="Times New Roman"/>
                 <w:sz w:val="16"/>
               </w:rPr>
-              <w:t>19</w:t>
+              <w:t>20</w:t>
             </w:r>
           </w:p>
         </w:tc>
@@ -1649,7 +1649,7 @@
                 <w:rFonts w:ascii="Times New Roman" w:hAnsi="Times New Roman"/>
                 <w:sz w:val="16"/>
               </w:rPr>
-              <w:t>8</w:t>
+              <w:t>25</w:t>
             </w:r>
           </w:p>
         </w:tc>
@@ -1673,7 +1673,7 @@
                 <w:rFonts w:ascii="Times New Roman" w:hAnsi="Times New Roman"/>
                 <w:sz w:val="16"/>
               </w:rPr>
-              <w:t>7</w:t>
+              <w:t>19</w:t>
             </w:r>
           </w:p>
         </w:tc>
@@ -1748,7 +1748,7 @@
                 <w:rFonts w:ascii="Times New Roman" w:hAnsi="Times New Roman"/>
                 <w:sz w:val="16"/>
               </w:rPr>
-              <w:t>32</w:t>
+              <w:t>30</w:t>
             </w:r>
           </w:p>
         </w:tc>
@@ -1772,7 +1772,7 @@
                 <w:rFonts w:ascii="Times New Roman" w:hAnsi="Times New Roman"/>
                 <w:sz w:val="16"/>
               </w:rPr>
-              <w:t>32</w:t>
+              <w:t>43</w:t>
             </w:r>
           </w:p>
         </w:tc>
@@ -1796,7 +1796,7 @@
                 <w:rFonts w:ascii="Times New Roman" w:hAnsi="Times New Roman"/>
                 <w:sz w:val="16"/>
               </w:rPr>
-              <w:t>31</w:t>
+              <w:t>41</w:t>
             </w:r>
           </w:p>
         </w:tc>
@@ -1907,7 +1907,7 @@
                 <w:rFonts w:ascii="Times New Roman" w:hAnsi="Times New Roman"/>
                 <w:sz w:val="16"/>
               </w:rPr>
-              <w:t>38.10% (8/21)</w:t>
+              <w:t>4.76% (1/21)</w:t>
             </w:r>
           </w:p>
         </w:tc>
@@ -1934,7 +1934,7 @@
                 <w:rFonts w:ascii="Times New Roman" w:hAnsi="Times New Roman"/>
                 <w:sz w:val="16"/>
               </w:rPr>
-              <w:t>33.33% (7/21)</w:t>
+              <w:t>9.52% (2/21)</w:t>
             </w:r>
           </w:p>
         </w:tc>
@@ -2009,7 +2009,7 @@
                 <w:rFonts w:ascii="Times New Roman" w:hAnsi="Times New Roman"/>
                 <w:sz w:val="16"/>
               </w:rPr>
-              <w:t>0.8190</w:t>
+              <w:t>0.8095</w:t>
             </w:r>
           </w:p>
         </w:tc>
@@ -2033,7 +2033,7 @@
                 <w:rFonts w:ascii="Times New Roman" w:hAnsi="Times New Roman"/>
                 <w:sz w:val="16"/>
               </w:rPr>
-              <w:t>0.9149</w:t>
+              <w:t>0.7423</w:t>
             </w:r>
           </w:p>
         </w:tc>
@@ -2057,7 +2057,7 @@
                 <w:rFonts w:ascii="Times New Roman" w:hAnsi="Times New Roman"/>
                 <w:sz w:val="16"/>
               </w:rPr>
-              <w:t>0.9255</w:t>
+              <w:t>0.7957</w:t>
             </w:r>
           </w:p>
         </w:tc>
@@ -2132,7 +2132,7 @@
                 <w:rFonts w:ascii="Times New Roman" w:hAnsi="Times New Roman"/>
                 <w:sz w:val="16"/>
               </w:rPr>
-              <w:t>0.7288</w:t>
+              <w:t>0.7391</w:t>
             </w:r>
           </w:p>
         </w:tc>
@@ -2156,7 +2156,7 @@
                 <w:rFonts w:ascii="Times New Roman" w:hAnsi="Times New Roman"/>
                 <w:sz w:val="16"/>
               </w:rPr>
-              <w:t>0.7288</w:t>
+              <w:t>0.6261</w:t>
             </w:r>
           </w:p>
         </w:tc>
@@ -2180,7 +2180,7 @@
                 <w:rFonts w:ascii="Times New Roman" w:hAnsi="Times New Roman"/>
                 <w:sz w:val="16"/>
               </w:rPr>
-              <w:t>0.7373</w:t>
+              <w:t>0.6435</w:t>
             </w:r>
           </w:p>
         </w:tc>
@@ -2264,7 +2264,7 @@
                 <w:rFonts w:ascii="Times New Roman" w:hAnsi="Times New Roman"/>
                 <w:sz w:val="16"/>
               </w:rPr>
-              <w:t>0.7713 [0.7035, 0.8458]</w:t>
+              <w:t>0.7727 [0.7078, 0.8462]</w:t>
             </w:r>
           </w:p>
         </w:tc>
@@ -2291,7 +2291,7 @@
                 <w:rFonts w:ascii="Times New Roman" w:hAnsi="Times New Roman"/>
                 <w:sz w:val="16"/>
               </w:rPr>
-              <w:t>0.8113 [0.7308, 0.8958]</w:t>
+              <w:t>0.6792 [0.5981, 0.7639]</w:t>
             </w:r>
           </w:p>
         </w:tc>
@@ -2318,7 +2318,7 @@
                 <w:rFonts w:ascii="Times New Roman" w:hAnsi="Times New Roman"/>
                 <w:sz w:val="16"/>
               </w:rPr>
-              <w:t>0.8208 [0.7480, 0.8934]</w:t>
+              <w:t>0.7115 [0.6368, 0.7917]</w:t>
             </w:r>
           </w:p>
         </w:tc>
@@ -2393,7 +2393,7 @@
                 <w:rFonts w:ascii="Times New Roman" w:hAnsi="Times New Roman"/>
                 <w:sz w:val="16"/>
               </w:rPr>
-              <w:t>0.6199</w:t>
+              <w:t>0.6557</w:t>
             </w:r>
           </w:p>
         </w:tc>
@@ -2417,7 +2417,7 @@
                 <w:rFonts w:ascii="Times New Roman" w:hAnsi="Times New Roman"/>
                 <w:sz w:val="16"/>
               </w:rPr>
-              <w:t>0.6812</w:t>
+              <w:t>0.5681</w:t>
             </w:r>
           </w:p>
         </w:tc>
@@ -2441,7 +2441,7 @@
                 <w:rFonts w:ascii="Times New Roman" w:hAnsi="Times New Roman"/>
                 <w:sz w:val="16"/>
               </w:rPr>
-              <w:t>0.6849</w:t>
+              <w:t>0.5904</w:t>
             </w:r>
           </w:p>
         </w:tc>
@@ -2516,7 +2516,7 @@
                 <w:rFonts w:ascii="Times New Roman" w:hAnsi="Times New Roman"/>
                 <w:sz w:val="16"/>
               </w:rPr>
-              <w:t>0.4860</w:t>
+              <w:t>0.5329</w:t>
             </w:r>
           </w:p>
         </w:tc>
@@ -2540,7 +2540,7 @@
                 <w:rFonts w:ascii="Times New Roman" w:hAnsi="Times New Roman"/>
                 <w:sz w:val="16"/>
               </w:rPr>
-              <w:t>0.4857</w:t>
+              <w:t>0.4188</w:t>
             </w:r>
           </w:p>
         </w:tc>
@@ -2564,7 +2564,7 @@
                 <w:rFonts w:ascii="Times New Roman" w:hAnsi="Times New Roman"/>
                 <w:sz w:val="16"/>
               </w:rPr>
-              <w:t>0.4971</w:t>
+              <w:t>0.4300</w:t>
             </w:r>
           </w:p>
         </w:tc>
@@ -2648,7 +2648,7 @@
                 <w:rFonts w:ascii="Times New Roman" w:hAnsi="Times New Roman"/>
                 <w:sz w:val="16"/>
               </w:rPr>
-              <w:t>0.5117 [0.3983, 0.5604]</w:t>
+              <w:t>0.5548 [0.4410, 0.6123]</w:t>
             </w:r>
           </w:p>
         </w:tc>
@@ -2675,7 +2675,7 @@
                 <w:rFonts w:ascii="Times New Roman" w:hAnsi="Times New Roman"/>
                 <w:sz w:val="16"/>
               </w:rPr>
-              <w:t>0.5421 [0.4192, 0.6067]</w:t>
+              <w:t>0.4581 [0.3372, 0.5237]</w:t>
             </w:r>
           </w:p>
         </w:tc>
@@ -2702,7 +2702,7 @@
                 <w:rFonts w:ascii="Times New Roman" w:hAnsi="Times New Roman"/>
                 <w:sz w:val="16"/>
               </w:rPr>
-              <w:t>0.5537 [0.4452, 0.6086]</w:t>
+              <w:t>0.4683 [0.3617, 0.5343]</w:t>
             </w:r>
           </w:p>
         </w:tc>
@@ -2777,7 +2777,7 @@
                 <w:rFonts w:ascii="Times New Roman" w:hAnsi="Times New Roman"/>
                 <w:sz w:val="16"/>
               </w:rPr>
-              <w:t>0.8494</w:t>
+              <w:t>0.8455</w:t>
             </w:r>
           </w:p>
         </w:tc>
@@ -2801,7 +2801,7 @@
                 <w:rFonts w:ascii="Times New Roman" w:hAnsi="Times New Roman"/>
                 <w:sz w:val="16"/>
               </w:rPr>
-              <w:t>0.9083</w:t>
+              <w:t>0.7767</w:t>
             </w:r>
           </w:p>
         </w:tc>
@@ -2825,7 +2825,7 @@
                 <w:rFonts w:ascii="Times New Roman" w:hAnsi="Times New Roman"/>
                 <w:sz w:val="16"/>
               </w:rPr>
-              <w:t>0.9254</w:t>
+              <w:t>0.7908</w:t>
             </w:r>
           </w:p>
         </w:tc>
@@ -2900,7 +2900,7 @@
                 <w:rFonts w:ascii="Times New Roman" w:hAnsi="Times New Roman"/>
                 <w:sz w:val="16"/>
               </w:rPr>
-              <w:t>0.7288</w:t>
+              <w:t>0.7391</w:t>
             </w:r>
           </w:p>
         </w:tc>
@@ -2924,7 +2924,7 @@
                 <w:rFonts w:ascii="Times New Roman" w:hAnsi="Times New Roman"/>
                 <w:sz w:val="16"/>
               </w:rPr>
-              <w:t>0.7288</w:t>
+              <w:t>0.6261</w:t>
             </w:r>
           </w:p>
         </w:tc>
@@ -2948,7 +2948,7 @@
                 <w:rFonts w:ascii="Times New Roman" w:hAnsi="Times New Roman"/>
                 <w:sz w:val="16"/>
               </w:rPr>
-              <w:t>0.7373</w:t>
+              <w:t>0.6435</w:t>
             </w:r>
           </w:p>
         </w:tc>
@@ -3023,7 +3023,7 @@
                 <w:rFonts w:ascii="Times New Roman" w:hAnsi="Times New Roman"/>
                 <w:sz w:val="16"/>
               </w:rPr>
-              <w:t>0.7550 [0.6675, 0.8292]</w:t>
+              <w:t>0.7617 [0.6764, 0.8396]</w:t>
             </w:r>
           </w:p>
         </w:tc>
@@ -3047,7 +3047,7 @@
                 <w:rFonts w:ascii="Times New Roman" w:hAnsi="Times New Roman"/>
                 <w:sz w:val="16"/>
               </w:rPr>
-              <w:t>0.7817 [0.6748, 0.8706]</w:t>
+              <w:t>0.6697 [0.5614, 0.7677]</w:t>
             </w:r>
           </w:p>
         </w:tc>
@@ -3071,7 +3071,7 @@
                 <w:rFonts w:ascii="Times New Roman" w:hAnsi="Times New Roman"/>
                 <w:sz w:val="16"/>
               </w:rPr>
-              <w:t>0.7941 [0.6903, 0.8710]</w:t>
+              <w:t>0.6799 [0.5789, 0.7703]</w:t>
             </w:r>
           </w:p>
         </w:tc>
@@ -3169,7 +3169,7 @@
           <w:rFonts w:ascii="Times New Roman" w:hAnsi="Times New Roman"/>
           <w:sz w:val="17"/>
         </w:rPr>
-        <w:t>Micro-F1, Macro-F1, Weighted-F1 y EMR entre Gemma-4-31B-it, Gemini Flash 3.5 y Gemini Flash 3.6.</w:t>
+        <w:t>Micro-F1, Macro-F1, Weighted-F1 y EMR entre Gemma-4-31B-it, Gemini Flash 3.5 y Gemini Flash 3.7.</w:t>
       </w:r>
     </w:p>
     <w:p>
@@ -3271,7 +3271,7 @@
           <w:rFonts w:ascii="Times New Roman" w:hAnsi="Times New Roman"/>
           <w:sz w:val="24"/>
         </w:rPr>
-        <w:t>Por componentes ontológicos (Tabla 2 y Figura 4), el mayor rendimiento se obtuvo en Funciones Corporales (b, F1 de 0.88 en Gemma, 0.91 en Flash 3.5 y 0.90 en Flash 3.6), destacando b280 («Dolor», F1 = 1.00) y b134 («Sueño», F1 = 1.00). En Actividades y Participación (d), el F1 osciló entre 0.68 y 0.76 (d450 «Andar»: F1 0.87–0.91; d640 «Quehaceres»: F1 0.86–0.93). En Factores Ambientales (e), el F1 se situó entre 0.69 y 0.76, con precisión del 100% en medicamentos (e1101, F1 0.83–0.92).</w:t>
+        <w:t>Por componentes ontológicos (Tabla 2 y Figura 4), el mayor rendimiento se obtuvo en Funciones Corporales (b, F1 de 0.88 en Gemma, 0.81 en Flash 3.5 y 0.84 en Flash 3.7), destacando b280 («Dolor», F1 = 1.00) y b134 («Sueño», F1 = 1.00). En Actividades y Participación (d), el F1 osciló entre 0.68 y 0.61 (d450 «Andar»: F1 0.87–0.91; d640 «Quehaceres»: F1 0.86–0.93). En Factores Ambientales (e), el F1 se situó entre 0.69 y 0.56, con precisión del 100% en medicamentos (e1101, F1 0.83–0.92).</w:t>
       </w:r>
     </w:p>
     <w:p>
@@ -3511,7 +3511,7 @@
                 <w:b/>
                 <w:sz w:val="16"/>
               </w:rPr>
-              <w:t>Flash 3.6 (F1)</w:t>
+              <w:t>Flash 3.7 (F1)</w:t>
             </w:r>
           </w:p>
         </w:tc>
@@ -3659,7 +3659,7 @@
                 <w:rFonts w:ascii="Times New Roman" w:hAnsi="Times New Roman"/>
                 <w:sz w:val="15"/>
               </w:rPr>
-              <w:t>1.00</w:t>
+              <w:t>0.67</w:t>
             </w:r>
           </w:p>
         </w:tc>
@@ -3683,7 +3683,7 @@
                 <w:rFonts w:ascii="Times New Roman" w:hAnsi="Times New Roman"/>
                 <w:sz w:val="15"/>
               </w:rPr>
-              <w:t>1.00</w:t>
+              <w:t>0.86</w:t>
             </w:r>
           </w:p>
         </w:tc>
@@ -4347,7 +4347,7 @@
                 <w:rFonts w:ascii="Times New Roman" w:hAnsi="Times New Roman"/>
                 <w:sz w:val="15"/>
               </w:rPr>
-              <w:t>1.00</w:t>
+              <w:t>0.67</w:t>
             </w:r>
           </w:p>
         </w:tc>
@@ -4371,7 +4371,7 @@
                 <w:rFonts w:ascii="Times New Roman" w:hAnsi="Times New Roman"/>
                 <w:sz w:val="15"/>
               </w:rPr>
-              <w:t>0.91</w:t>
+              <w:t>0.80</w:t>
             </w:r>
           </w:p>
         </w:tc>
@@ -4423,7 +4423,7 @@
                 <w:b/>
                 <w:sz w:val="15"/>
               </w:rPr>
-              <w:t>b175</w:t>
+              <w:t>b280</w:t>
             </w:r>
           </w:p>
         </w:tc>
@@ -4447,7 +4447,7 @@
                 <w:rFonts w:ascii="Times New Roman" w:hAnsi="Times New Roman"/>
                 <w:sz w:val="15"/>
               </w:rPr>
-              <w:t>Funciones cognitivas superiores (Resolver problemas)</w:t>
+              <w:t>Sensación de dolor</w:t>
             </w:r>
           </w:p>
         </w:tc>
@@ -4471,7 +4471,7 @@
                 <w:rFonts w:ascii="Times New Roman" w:hAnsi="Times New Roman"/>
                 <w:sz w:val="15"/>
               </w:rPr>
-              <w:t>0</w:t>
+              <w:t>21</w:t>
             </w:r>
           </w:p>
         </w:tc>
@@ -4495,7 +4495,7 @@
                 <w:rFonts w:ascii="Times New Roman" w:hAnsi="Times New Roman"/>
                 <w:sz w:val="15"/>
               </w:rPr>
-              <w:t>0.00</w:t>
+              <w:t>1.00</w:t>
             </w:r>
           </w:p>
         </w:tc>
@@ -4519,7 +4519,7 @@
                 <w:rFonts w:ascii="Times New Roman" w:hAnsi="Times New Roman"/>
                 <w:sz w:val="15"/>
               </w:rPr>
-              <w:t>0.00</w:t>
+              <w:t>1.00</w:t>
             </w:r>
           </w:p>
         </w:tc>
@@ -4543,7 +4543,7 @@
                 <w:rFonts w:ascii="Times New Roman" w:hAnsi="Times New Roman"/>
                 <w:sz w:val="15"/>
               </w:rPr>
-              <w:t>0.00</w:t>
+              <w:t>1.00</w:t>
             </w:r>
           </w:p>
         </w:tc>
@@ -4595,7 +4595,7 @@
                 <w:b/>
                 <w:sz w:val="15"/>
               </w:rPr>
-              <w:t>b240</w:t>
+              <w:t>b455</w:t>
             </w:r>
           </w:p>
         </w:tc>
@@ -4619,7 +4619,7 @@
                 <w:rFonts w:ascii="Times New Roman" w:hAnsi="Times New Roman"/>
                 <w:sz w:val="15"/>
               </w:rPr>
-              <w:t>Sensaciones corporales y manejo del estrés</w:t>
+              <w:t>Tolerancia al ejercicio físico</w:t>
             </w:r>
           </w:p>
         </w:tc>
@@ -4643,7 +4643,7 @@
                 <w:rFonts w:ascii="Times New Roman" w:hAnsi="Times New Roman"/>
                 <w:sz w:val="15"/>
               </w:rPr>
-              <w:t>0</w:t>
+              <w:t>5</w:t>
             </w:r>
           </w:p>
         </w:tc>
@@ -4667,7 +4667,7 @@
                 <w:rFonts w:ascii="Times New Roman" w:hAnsi="Times New Roman"/>
                 <w:sz w:val="15"/>
               </w:rPr>
-              <w:t>0.00</w:t>
+              <w:t>0.67</w:t>
             </w:r>
           </w:p>
         </w:tc>
@@ -4691,7 +4691,7 @@
                 <w:rFonts w:ascii="Times New Roman" w:hAnsi="Times New Roman"/>
                 <w:sz w:val="15"/>
               </w:rPr>
-              <w:t>0.00</w:t>
+              <w:t>0.25</w:t>
             </w:r>
           </w:p>
         </w:tc>
@@ -4715,7 +4715,7 @@
                 <w:rFonts w:ascii="Times New Roman" w:hAnsi="Times New Roman"/>
                 <w:sz w:val="15"/>
               </w:rPr>
-              <w:t>0.00</w:t>
+              <w:t>0.29</w:t>
             </w:r>
           </w:p>
         </w:tc>
@@ -4767,7 +4767,7 @@
                 <w:b/>
                 <w:sz w:val="15"/>
               </w:rPr>
-              <w:t>b280</w:t>
+              <w:t>b730</w:t>
             </w:r>
           </w:p>
         </w:tc>
@@ -4791,7 +4791,7 @@
                 <w:rFonts w:ascii="Times New Roman" w:hAnsi="Times New Roman"/>
                 <w:sz w:val="15"/>
               </w:rPr>
-              <w:t>Sensación de dolor</w:t>
+              <w:t>Funciones relacionadas con la fuerza muscular</w:t>
             </w:r>
           </w:p>
         </w:tc>
@@ -4815,7 +4815,7 @@
                 <w:rFonts w:ascii="Times New Roman" w:hAnsi="Times New Roman"/>
                 <w:sz w:val="15"/>
               </w:rPr>
-              <w:t>21</w:t>
+              <w:t>6</w:t>
             </w:r>
           </w:p>
         </w:tc>
@@ -4839,7 +4839,7 @@
                 <w:rFonts w:ascii="Times New Roman" w:hAnsi="Times New Roman"/>
                 <w:sz w:val="15"/>
               </w:rPr>
-              <w:t>1.00</w:t>
+              <w:t>0.55</w:t>
             </w:r>
           </w:p>
         </w:tc>
@@ -4863,7 +4863,7 @@
                 <w:rFonts w:ascii="Times New Roman" w:hAnsi="Times New Roman"/>
                 <w:sz w:val="15"/>
               </w:rPr>
-              <w:t>1.00</w:t>
+              <w:t>0.60</w:t>
             </w:r>
           </w:p>
         </w:tc>
@@ -4887,7 +4887,7 @@
                 <w:rFonts w:ascii="Times New Roman" w:hAnsi="Times New Roman"/>
                 <w:sz w:val="15"/>
               </w:rPr>
-              <w:t>1.00</w:t>
+              <w:t>0.44</w:t>
             </w:r>
           </w:p>
         </w:tc>
@@ -4939,7 +4939,7 @@
                 <w:b/>
                 <w:sz w:val="15"/>
               </w:rPr>
-              <w:t>b455</w:t>
+              <w:t>b760</w:t>
             </w:r>
           </w:p>
         </w:tc>
@@ -4963,7 +4963,7 @@
                 <w:rFonts w:ascii="Times New Roman" w:hAnsi="Times New Roman"/>
                 <w:sz w:val="15"/>
               </w:rPr>
-              <w:t>Tolerancia al ejercicio físico</w:t>
+              <w:t>Control de los movimientos voluntarios</w:t>
             </w:r>
           </w:p>
         </w:tc>
@@ -4987,7 +4987,7 @@
                 <w:rFonts w:ascii="Times New Roman" w:hAnsi="Times New Roman"/>
                 <w:sz w:val="15"/>
               </w:rPr>
-              <w:t>5</w:t>
+              <w:t>1</w:t>
             </w:r>
           </w:p>
         </w:tc>
@@ -5011,7 +5011,7 @@
                 <w:rFonts w:ascii="Times New Roman" w:hAnsi="Times New Roman"/>
                 <w:sz w:val="15"/>
               </w:rPr>
-              <w:t>0.67</w:t>
+              <w:t>0.00</w:t>
             </w:r>
           </w:p>
         </w:tc>
@@ -5035,7 +5035,7 @@
                 <w:rFonts w:ascii="Times New Roman" w:hAnsi="Times New Roman"/>
                 <w:sz w:val="15"/>
               </w:rPr>
-              <w:t>0.57</w:t>
+              <w:t>0.00</w:t>
             </w:r>
           </w:p>
         </w:tc>
@@ -5059,7 +5059,7 @@
                 <w:rFonts w:ascii="Times New Roman" w:hAnsi="Times New Roman"/>
                 <w:sz w:val="15"/>
               </w:rPr>
-              <w:t>0.57</w:t>
+              <w:t>0.00</w:t>
             </w:r>
           </w:p>
         </w:tc>
@@ -5086,7 +5086,7 @@
                 <w:i/>
                 <w:sz w:val="15"/>
               </w:rPr>
-              <w:t>Funciones Corporales</w:t>
+              <w:t>Actividades y Participación</w:t>
             </w:r>
           </w:p>
         </w:tc>
@@ -5111,7 +5111,7 @@
                 <w:b/>
                 <w:sz w:val="15"/>
               </w:rPr>
-              <w:t>b730</w:t>
+              <w:t>d175</w:t>
             </w:r>
           </w:p>
         </w:tc>
@@ -5135,7 +5135,7 @@
                 <w:rFonts w:ascii="Times New Roman" w:hAnsi="Times New Roman"/>
                 <w:sz w:val="15"/>
               </w:rPr>
-              <w:t>Funciones relacionadas con la fuerza muscular</w:t>
+              <w:t>Resolver problemas</w:t>
             </w:r>
           </w:p>
         </w:tc>
@@ -5159,7 +5159,7 @@
                 <w:rFonts w:ascii="Times New Roman" w:hAnsi="Times New Roman"/>
                 <w:sz w:val="15"/>
               </w:rPr>
-              <w:t>6</w:t>
+              <w:t>3</w:t>
             </w:r>
           </w:p>
         </w:tc>
@@ -5183,7 +5183,7 @@
                 <w:rFonts w:ascii="Times New Roman" w:hAnsi="Times New Roman"/>
                 <w:sz w:val="15"/>
               </w:rPr>
-              <w:t>0.55</w:t>
+              <w:t>0.50</w:t>
             </w:r>
           </w:p>
         </w:tc>
@@ -5207,7 +5207,7 @@
                 <w:rFonts w:ascii="Times New Roman" w:hAnsi="Times New Roman"/>
                 <w:sz w:val="15"/>
               </w:rPr>
-              <w:t>0.60</w:t>
+              <w:t>0.50</w:t>
             </w:r>
           </w:p>
         </w:tc>
@@ -5231,7 +5231,7 @@
                 <w:rFonts w:ascii="Times New Roman" w:hAnsi="Times New Roman"/>
                 <w:sz w:val="15"/>
               </w:rPr>
-              <w:t>0.60</w:t>
+              <w:t>0.50</w:t>
             </w:r>
           </w:p>
         </w:tc>
@@ -5261,7 +5261,7 @@
                 <w:i/>
                 <w:sz w:val="15"/>
               </w:rPr>
-              <w:t>Funciones Corporales</w:t>
+              <w:t>Actividades y Participación</w:t>
             </w:r>
           </w:p>
         </w:tc>
@@ -5289,7 +5289,7 @@
                 <w:b/>
                 <w:sz w:val="15"/>
               </w:rPr>
-              <w:t>b760</w:t>
+              <w:t>d230</w:t>
             </w:r>
           </w:p>
         </w:tc>
@@ -5316,7 +5316,7 @@
                 <w:rFonts w:ascii="Times New Roman" w:hAnsi="Times New Roman"/>
                 <w:sz w:val="15"/>
               </w:rPr>
-              <w:t>Control de los movimientos voluntarios</w:t>
+              <w:t>Llevar a cabo rutinas diarias</w:t>
             </w:r>
           </w:p>
         </w:tc>
@@ -5343,7 +5343,7 @@
                 <w:rFonts w:ascii="Times New Roman" w:hAnsi="Times New Roman"/>
                 <w:sz w:val="15"/>
               </w:rPr>
-              <w:t>1</w:t>
+              <w:t>7</w:t>
             </w:r>
           </w:p>
         </w:tc>
@@ -5370,7 +5370,7 @@
                 <w:rFonts w:ascii="Times New Roman" w:hAnsi="Times New Roman"/>
                 <w:sz w:val="15"/>
               </w:rPr>
-              <w:t>0.00</w:t>
+              <w:t>0.77</w:t>
             </w:r>
           </w:p>
         </w:tc>
@@ -5397,7 +5397,7 @@
                 <w:rFonts w:ascii="Times New Roman" w:hAnsi="Times New Roman"/>
                 <w:sz w:val="15"/>
               </w:rPr>
-              <w:t>0.00</w:t>
+              <w:t>0.50</w:t>
             </w:r>
           </w:p>
         </w:tc>
@@ -5424,7 +5424,7 @@
                 <w:rFonts w:ascii="Times New Roman" w:hAnsi="Times New Roman"/>
                 <w:sz w:val="15"/>
               </w:rPr>
-              <w:t>0.00</w:t>
+              <w:t>0.50</w:t>
             </w:r>
           </w:p>
         </w:tc>
@@ -5476,7 +5476,7 @@
                 <w:b/>
                 <w:sz w:val="15"/>
               </w:rPr>
-              <w:t>d175</w:t>
+              <w:t>d240</w:t>
             </w:r>
           </w:p>
         </w:tc>
@@ -5500,7 +5500,7 @@
                 <w:rFonts w:ascii="Times New Roman" w:hAnsi="Times New Roman"/>
                 <w:sz w:val="15"/>
               </w:rPr>
-              <w:t>Resolver problemas</w:t>
+              <w:t>Manejo del estrés y demandas psicológicas</w:t>
             </w:r>
           </w:p>
         </w:tc>
@@ -5648,7 +5648,7 @@
                 <w:b/>
                 <w:sz w:val="15"/>
               </w:rPr>
-              <w:t>d230</w:t>
+              <w:t>d430</w:t>
             </w:r>
           </w:p>
         </w:tc>
@@ -5672,7 +5672,7 @@
                 <w:rFonts w:ascii="Times New Roman" w:hAnsi="Times New Roman"/>
                 <w:sz w:val="15"/>
               </w:rPr>
-              <w:t>Llevar a cabo rutinas diarias</w:t>
+              <w:t>Levantar y llevar objetos</w:t>
             </w:r>
           </w:p>
         </w:tc>
@@ -5696,7 +5696,7 @@
                 <w:rFonts w:ascii="Times New Roman" w:hAnsi="Times New Roman"/>
                 <w:sz w:val="15"/>
               </w:rPr>
-              <w:t>7</w:t>
+              <w:t>8</w:t>
             </w:r>
           </w:p>
         </w:tc>
@@ -5720,7 +5720,7 @@
                 <w:rFonts w:ascii="Times New Roman" w:hAnsi="Times New Roman"/>
                 <w:sz w:val="15"/>
               </w:rPr>
-              <w:t>0.77</w:t>
+              <w:t>0.62</w:t>
             </w:r>
           </w:p>
         </w:tc>
@@ -5744,7 +5744,7 @@
                 <w:rFonts w:ascii="Times New Roman" w:hAnsi="Times New Roman"/>
                 <w:sz w:val="15"/>
               </w:rPr>
-              <w:t>0.77</w:t>
+              <w:t>0.62</w:t>
             </w:r>
           </w:p>
         </w:tc>
@@ -5768,7 +5768,7 @@
                 <w:rFonts w:ascii="Times New Roman" w:hAnsi="Times New Roman"/>
                 <w:sz w:val="15"/>
               </w:rPr>
-              <w:t>0.83</w:t>
+              <w:t>0.62</w:t>
             </w:r>
           </w:p>
         </w:tc>
@@ -5820,7 +5820,7 @@
                 <w:b/>
                 <w:sz w:val="15"/>
               </w:rPr>
-              <w:t>d240</w:t>
+              <w:t>d450</w:t>
             </w:r>
           </w:p>
         </w:tc>
@@ -5844,7 +5844,7 @@
                 <w:rFonts w:ascii="Times New Roman" w:hAnsi="Times New Roman"/>
                 <w:sz w:val="15"/>
               </w:rPr>
-              <w:t>Manejo del estrés y demandas psicológicas</w:t>
+              <w:t>Andar y desplazarse</w:t>
             </w:r>
           </w:p>
         </w:tc>
@@ -5868,7 +5868,7 @@
                 <w:rFonts w:ascii="Times New Roman" w:hAnsi="Times New Roman"/>
                 <w:sz w:val="15"/>
               </w:rPr>
-              <w:t>3</w:t>
+              <w:t>4</w:t>
             </w:r>
           </w:p>
         </w:tc>
@@ -5892,7 +5892,7 @@
                 <w:rFonts w:ascii="Times New Roman" w:hAnsi="Times New Roman"/>
                 <w:sz w:val="15"/>
               </w:rPr>
-              <w:t>0.50</w:t>
+              <w:t>0.40</w:t>
             </w:r>
           </w:p>
         </w:tc>
@@ -5916,7 +5916,7 @@
                 <w:rFonts w:ascii="Times New Roman" w:hAnsi="Times New Roman"/>
                 <w:sz w:val="15"/>
               </w:rPr>
-              <w:t>0.50</w:t>
+              <w:t>0.00</w:t>
             </w:r>
           </w:p>
         </w:tc>
@@ -5940,7 +5940,7 @@
                 <w:rFonts w:ascii="Times New Roman" w:hAnsi="Times New Roman"/>
                 <w:sz w:val="15"/>
               </w:rPr>
-              <w:t>0.80</w:t>
+              <w:t>0.00</w:t>
             </w:r>
           </w:p>
         </w:tc>
@@ -5992,7 +5992,7 @@
                 <w:b/>
                 <w:sz w:val="15"/>
               </w:rPr>
-              <w:t>d290</w:t>
+              <w:t>d640</w:t>
             </w:r>
           </w:p>
         </w:tc>
@@ -6016,7 +6016,7 @@
                 <w:rFonts w:ascii="Times New Roman" w:hAnsi="Times New Roman"/>
                 <w:sz w:val="15"/>
               </w:rPr>
-              <w:t>Tareas y demandas generales (Ocio)</w:t>
+              <w:t>Realizar los quehaceres de la casa</w:t>
             </w:r>
           </w:p>
         </w:tc>
@@ -6040,7 +6040,7 @@
                 <w:rFonts w:ascii="Times New Roman" w:hAnsi="Times New Roman"/>
                 <w:sz w:val="15"/>
               </w:rPr>
-              <w:t>0</w:t>
+              <w:t>4</w:t>
             </w:r>
           </w:p>
         </w:tc>
@@ -6064,7 +6064,7 @@
                 <w:rFonts w:ascii="Times New Roman" w:hAnsi="Times New Roman"/>
                 <w:sz w:val="15"/>
               </w:rPr>
-              <w:t>0.00</w:t>
+              <w:t>0.50</w:t>
             </w:r>
           </w:p>
         </w:tc>
@@ -6088,7 +6088,7 @@
                 <w:rFonts w:ascii="Times New Roman" w:hAnsi="Times New Roman"/>
                 <w:sz w:val="15"/>
               </w:rPr>
-              <w:t>0.00</w:t>
+              <w:t>0.50</w:t>
             </w:r>
           </w:p>
         </w:tc>
@@ -6112,7 +6112,7 @@
                 <w:rFonts w:ascii="Times New Roman" w:hAnsi="Times New Roman"/>
                 <w:sz w:val="15"/>
               </w:rPr>
-              <w:t>0.00</w:t>
+              <w:t>0.40</w:t>
             </w:r>
           </w:p>
         </w:tc>
@@ -6164,7 +6164,7 @@
                 <w:b/>
                 <w:sz w:val="15"/>
               </w:rPr>
-              <w:t>d430</w:t>
+              <w:t>d760</w:t>
             </w:r>
           </w:p>
         </w:tc>
@@ -6188,7 +6188,7 @@
                 <w:rFonts w:ascii="Times New Roman" w:hAnsi="Times New Roman"/>
                 <w:sz w:val="15"/>
               </w:rPr>
-              <w:t>Levantar y llevar objetos</w:t>
+              <w:t>Relaciones familiares</w:t>
             </w:r>
           </w:p>
         </w:tc>
@@ -6212,7 +6212,7 @@
                 <w:rFonts w:ascii="Times New Roman" w:hAnsi="Times New Roman"/>
                 <w:sz w:val="15"/>
               </w:rPr>
-              <w:t>8</w:t>
+              <w:t>3</w:t>
             </w:r>
           </w:p>
         </w:tc>
@@ -6236,7 +6236,7 @@
                 <w:rFonts w:ascii="Times New Roman" w:hAnsi="Times New Roman"/>
                 <w:sz w:val="15"/>
               </w:rPr>
-              <w:t>0.62</w:t>
+              <w:t>0.40</w:t>
             </w:r>
           </w:p>
         </w:tc>
@@ -6260,7 +6260,7 @@
                 <w:rFonts w:ascii="Times New Roman" w:hAnsi="Times New Roman"/>
                 <w:sz w:val="15"/>
               </w:rPr>
-              <w:t>0.62</w:t>
+              <w:t>0.00</w:t>
             </w:r>
           </w:p>
         </w:tc>
@@ -6284,7 +6284,7 @@
                 <w:rFonts w:ascii="Times New Roman" w:hAnsi="Times New Roman"/>
                 <w:sz w:val="15"/>
               </w:rPr>
-              <w:t>0.67</w:t>
+              <w:t>0.00</w:t>
             </w:r>
           </w:p>
         </w:tc>
@@ -6336,7 +6336,7 @@
                 <w:b/>
                 <w:sz w:val="15"/>
               </w:rPr>
-              <w:t>d450</w:t>
+              <w:t>d770</w:t>
             </w:r>
           </w:p>
         </w:tc>
@@ -6360,7 +6360,7 @@
                 <w:rFonts w:ascii="Times New Roman" w:hAnsi="Times New Roman"/>
                 <w:sz w:val="15"/>
               </w:rPr>
-              <w:t>Andar y desplazarse</w:t>
+              <w:t>Relaciones íntimas y sociales</w:t>
             </w:r>
           </w:p>
         </w:tc>
@@ -6384,7 +6384,7 @@
                 <w:rFonts w:ascii="Times New Roman" w:hAnsi="Times New Roman"/>
                 <w:sz w:val="15"/>
               </w:rPr>
-              <w:t>4</w:t>
+              <w:t>0</w:t>
             </w:r>
           </w:p>
         </w:tc>
@@ -6408,7 +6408,7 @@
                 <w:rFonts w:ascii="Times New Roman" w:hAnsi="Times New Roman"/>
                 <w:sz w:val="15"/>
               </w:rPr>
-              <w:t>0.40</w:t>
+              <w:t>0.00</w:t>
             </w:r>
           </w:p>
         </w:tc>
@@ -6432,7 +6432,7 @@
                 <w:rFonts w:ascii="Times New Roman" w:hAnsi="Times New Roman"/>
                 <w:sz w:val="15"/>
               </w:rPr>
-              <w:t>0.40</w:t>
+              <w:t>0.00</w:t>
             </w:r>
           </w:p>
         </w:tc>
@@ -6456,7 +6456,7 @@
                 <w:rFonts w:ascii="Times New Roman" w:hAnsi="Times New Roman"/>
                 <w:sz w:val="15"/>
               </w:rPr>
-              <w:t>0.40</w:t>
+              <w:t>0.00</w:t>
             </w:r>
           </w:p>
         </w:tc>
@@ -6508,7 +6508,7 @@
                 <w:b/>
                 <w:sz w:val="15"/>
               </w:rPr>
-              <w:t>d640</w:t>
+              <w:t>d850</w:t>
             </w:r>
           </w:p>
         </w:tc>
@@ -6532,7 +6532,7 @@
                 <w:rFonts w:ascii="Times New Roman" w:hAnsi="Times New Roman"/>
                 <w:sz w:val="15"/>
               </w:rPr>
-              <w:t>Realizar los quehaceres de la casa</w:t>
+              <w:t>Trabajo remunerado</w:t>
             </w:r>
           </w:p>
         </w:tc>
@@ -6556,7 +6556,7 @@
                 <w:rFonts w:ascii="Times New Roman" w:hAnsi="Times New Roman"/>
                 <w:sz w:val="15"/>
               </w:rPr>
-              <w:t>4</w:t>
+              <w:t>7</w:t>
             </w:r>
           </w:p>
         </w:tc>
@@ -6580,7 +6580,7 @@
                 <w:rFonts w:ascii="Times New Roman" w:hAnsi="Times New Roman"/>
                 <w:sz w:val="15"/>
               </w:rPr>
-              <w:t>0.50</w:t>
+              <w:t>0.88</w:t>
             </w:r>
           </w:p>
         </w:tc>
@@ -6604,7 +6604,7 @@
                 <w:rFonts w:ascii="Times New Roman" w:hAnsi="Times New Roman"/>
                 <w:sz w:val="15"/>
               </w:rPr>
-              <w:t>0.67</w:t>
+              <w:t>0.80</w:t>
             </w:r>
           </w:p>
         </w:tc>
@@ -6628,7 +6628,7 @@
                 <w:rFonts w:ascii="Times New Roman" w:hAnsi="Times New Roman"/>
                 <w:sz w:val="15"/>
               </w:rPr>
-              <w:t>0.57</w:t>
+              <w:t>0.88</w:t>
             </w:r>
           </w:p>
         </w:tc>
@@ -6680,7 +6680,7 @@
                 <w:b/>
                 <w:sz w:val="15"/>
               </w:rPr>
-              <w:t>d760</w:t>
+              <w:t>d920</w:t>
             </w:r>
           </w:p>
         </w:tc>
@@ -6704,7 +6704,7 @@
                 <w:rFonts w:ascii="Times New Roman" w:hAnsi="Times New Roman"/>
                 <w:sz w:val="15"/>
               </w:rPr>
-              <w:t>Relaciones familiares</w:t>
+              <w:t>Tiempo libre y ocio</w:t>
             </w:r>
           </w:p>
         </w:tc>
@@ -6728,7 +6728,7 @@
                 <w:rFonts w:ascii="Times New Roman" w:hAnsi="Times New Roman"/>
                 <w:sz w:val="15"/>
               </w:rPr>
-              <w:t>3</w:t>
+              <w:t>8</w:t>
             </w:r>
           </w:p>
         </w:tc>
@@ -6752,7 +6752,7 @@
                 <w:rFonts w:ascii="Times New Roman" w:hAnsi="Times New Roman"/>
                 <w:sz w:val="15"/>
               </w:rPr>
-              <w:t>0.40</w:t>
+              <w:t>0.88</w:t>
             </w:r>
           </w:p>
         </w:tc>
@@ -6776,7 +6776,7 @@
                 <w:rFonts w:ascii="Times New Roman" w:hAnsi="Times New Roman"/>
                 <w:sz w:val="15"/>
               </w:rPr>
-              <w:t>0.80</w:t>
+              <w:t>0.86</w:t>
             </w:r>
           </w:p>
         </w:tc>
@@ -6800,7 +6800,7 @@
                 <w:rFonts w:ascii="Times New Roman" w:hAnsi="Times New Roman"/>
                 <w:sz w:val="15"/>
               </w:rPr>
-              <w:t>0.80</w:t>
+              <w:t>0.88</w:t>
             </w:r>
           </w:p>
         </w:tc>
@@ -6827,7 +6827,7 @@
                 <w:i/>
                 <w:sz w:val="15"/>
               </w:rPr>
-              <w:t>Actividades y Participación</w:t>
+              <w:t>Factores Ambientales</w:t>
             </w:r>
           </w:p>
         </w:tc>
@@ -6852,7 +6852,7 @@
                 <w:b/>
                 <w:sz w:val="15"/>
               </w:rPr>
-              <w:t>d770</w:t>
+              <w:t>e1101</w:t>
             </w:r>
           </w:p>
         </w:tc>
@@ -6876,7 +6876,7 @@
                 <w:rFonts w:ascii="Times New Roman" w:hAnsi="Times New Roman"/>
                 <w:sz w:val="15"/>
               </w:rPr>
-              <w:t>Relaciones íntimas y sociales</w:t>
+              <w:t>Medicamentos</w:t>
             </w:r>
           </w:p>
         </w:tc>
@@ -6900,7 +6900,7 @@
                 <w:rFonts w:ascii="Times New Roman" w:hAnsi="Times New Roman"/>
                 <w:sz w:val="15"/>
               </w:rPr>
-              <w:t>3</w:t>
+              <w:t>7</w:t>
             </w:r>
           </w:p>
         </w:tc>
@@ -6924,7 +6924,7 @@
                 <w:rFonts w:ascii="Times New Roman" w:hAnsi="Times New Roman"/>
                 <w:sz w:val="15"/>
               </w:rPr>
-              <w:t>0.50</w:t>
+              <w:t>0.82</w:t>
             </w:r>
           </w:p>
         </w:tc>
@@ -6948,7 +6948,7 @@
                 <w:rFonts w:ascii="Times New Roman" w:hAnsi="Times New Roman"/>
                 <w:sz w:val="15"/>
               </w:rPr>
-              <w:t>0.50</w:t>
+              <w:t>0.82</w:t>
             </w:r>
           </w:p>
         </w:tc>
@@ -6972,7 +6972,7 @@
                 <w:rFonts w:ascii="Times New Roman" w:hAnsi="Times New Roman"/>
                 <w:sz w:val="15"/>
               </w:rPr>
-              <w:t>0.50</w:t>
+              <w:t>0.82</w:t>
             </w:r>
           </w:p>
         </w:tc>
@@ -6999,7 +6999,7 @@
                 <w:i/>
                 <w:sz w:val="15"/>
               </w:rPr>
-              <w:t>Actividades y Participación</w:t>
+              <w:t>Factores Ambientales</w:t>
             </w:r>
           </w:p>
         </w:tc>
@@ -7024,7 +7024,7 @@
                 <w:b/>
                 <w:sz w:val="15"/>
               </w:rPr>
-              <w:t>d850</w:t>
+              <w:t>e310</w:t>
             </w:r>
           </w:p>
         </w:tc>
@@ -7048,7 +7048,7 @@
                 <w:rFonts w:ascii="Times New Roman" w:hAnsi="Times New Roman"/>
                 <w:sz w:val="15"/>
               </w:rPr>
-              <w:t>Trabajo remunerado</w:t>
+              <w:t>Familiares cercanos</w:t>
             </w:r>
           </w:p>
         </w:tc>
@@ -7072,7 +7072,7 @@
                 <w:rFonts w:ascii="Times New Roman" w:hAnsi="Times New Roman"/>
                 <w:sz w:val="15"/>
               </w:rPr>
-              <w:t>7</w:t>
+              <w:t>0</w:t>
             </w:r>
           </w:p>
         </w:tc>
@@ -7096,7 +7096,7 @@
                 <w:rFonts w:ascii="Times New Roman" w:hAnsi="Times New Roman"/>
                 <w:sz w:val="15"/>
               </w:rPr>
-              <w:t>0.88</w:t>
+              <w:t>0.00</w:t>
             </w:r>
           </w:p>
         </w:tc>
@@ -7120,7 +7120,7 @@
                 <w:rFonts w:ascii="Times New Roman" w:hAnsi="Times New Roman"/>
                 <w:sz w:val="15"/>
               </w:rPr>
-              <w:t>0.86</w:t>
+              <w:t>0.00</w:t>
             </w:r>
           </w:p>
         </w:tc>
@@ -7144,7 +7144,7 @@
                 <w:rFonts w:ascii="Times New Roman" w:hAnsi="Times New Roman"/>
                 <w:sz w:val="15"/>
               </w:rPr>
-              <w:t>0.93</w:t>
+              <w:t>0.00</w:t>
             </w:r>
           </w:p>
         </w:tc>
@@ -7174,7 +7174,7 @@
                 <w:i/>
                 <w:sz w:val="15"/>
               </w:rPr>
-              <w:t>Actividades y Participación</w:t>
+              <w:t>Factores Ambientales</w:t>
             </w:r>
           </w:p>
         </w:tc>
@@ -7202,7 +7202,7 @@
                 <w:b/>
                 <w:sz w:val="15"/>
               </w:rPr>
-              <w:t>d920</w:t>
+              <w:t>e355</w:t>
             </w:r>
           </w:p>
         </w:tc>
@@ -7229,7 +7229,7 @@
                 <w:rFonts w:ascii="Times New Roman" w:hAnsi="Times New Roman"/>
                 <w:sz w:val="15"/>
               </w:rPr>
-              <w:t>Tiempo libre y ocio</w:t>
+              <w:t>Profesionales de la salud</w:t>
             </w:r>
           </w:p>
         </w:tc>
@@ -7256,7 +7256,7 @@
                 <w:rFonts w:ascii="Times New Roman" w:hAnsi="Times New Roman"/>
                 <w:sz w:val="15"/>
               </w:rPr>
-              <w:t>8</w:t>
+              <w:t>2</w:t>
             </w:r>
           </w:p>
         </w:tc>
@@ -7283,7 +7283,7 @@
                 <w:rFonts w:ascii="Times New Roman" w:hAnsi="Times New Roman"/>
                 <w:sz w:val="15"/>
               </w:rPr>
-              <w:t>0.88</w:t>
+              <w:t>0.57</w:t>
             </w:r>
           </w:p>
         </w:tc>
@@ -7310,7 +7310,7 @@
                 <w:rFonts w:ascii="Times New Roman" w:hAnsi="Times New Roman"/>
                 <w:sz w:val="15"/>
               </w:rPr>
-              <w:t>0.88</w:t>
+              <w:t>0.29</w:t>
             </w:r>
           </w:p>
         </w:tc>
@@ -7337,7 +7337,7 @@
                 <w:rFonts w:ascii="Times New Roman" w:hAnsi="Times New Roman"/>
                 <w:sz w:val="15"/>
               </w:rPr>
-              <w:t>0.93</w:t>
+              <w:t>0.33</w:t>
             </w:r>
           </w:p>
         </w:tc>
@@ -7389,7 +7389,7 @@
                 <w:b/>
                 <w:sz w:val="15"/>
               </w:rPr>
-              <w:t>e1101</w:t>
+              <w:t>e410</w:t>
             </w:r>
           </w:p>
         </w:tc>
@@ -7413,7 +7413,7 @@
                 <w:rFonts w:ascii="Times New Roman" w:hAnsi="Times New Roman"/>
                 <w:sz w:val="15"/>
               </w:rPr>
-              <w:t>Medicamentos</w:t>
+              <w:t>Actitudes individuales de miembros de la familia cercana</w:t>
             </w:r>
           </w:p>
         </w:tc>
@@ -7437,7 +7437,7 @@
                 <w:rFonts w:ascii="Times New Roman" w:hAnsi="Times New Roman"/>
                 <w:sz w:val="15"/>
               </w:rPr>
-              <w:t>7</w:t>
+              <w:t>1</w:t>
             </w:r>
           </w:p>
         </w:tc>
@@ -7461,7 +7461,7 @@
                 <w:rFonts w:ascii="Times New Roman" w:hAnsi="Times New Roman"/>
                 <w:sz w:val="15"/>
               </w:rPr>
-              <w:t>0.82</w:t>
+              <w:t>0.00</w:t>
             </w:r>
           </w:p>
         </w:tc>
@@ -7485,7 +7485,7 @@
                 <w:rFonts w:ascii="Times New Roman" w:hAnsi="Times New Roman"/>
                 <w:sz w:val="15"/>
               </w:rPr>
-              <w:t>0.88</w:t>
+              <w:t>0.00</w:t>
             </w:r>
           </w:p>
         </w:tc>
@@ -7509,7 +7509,7 @@
                 <w:rFonts w:ascii="Times New Roman" w:hAnsi="Times New Roman"/>
                 <w:sz w:val="15"/>
               </w:rPr>
-              <w:t>0.82</w:t>
+              <w:t>0.00</w:t>
             </w:r>
           </w:p>
         </w:tc>
@@ -7561,7 +7561,7 @@
                 <w:b/>
                 <w:sz w:val="15"/>
               </w:rPr>
-              <w:t>e310</w:t>
+              <w:t>e570</w:t>
             </w:r>
           </w:p>
         </w:tc>
@@ -7585,7 +7585,7 @@
                 <w:rFonts w:ascii="Times New Roman" w:hAnsi="Times New Roman"/>
                 <w:sz w:val="15"/>
               </w:rPr>
-              <w:t>Familiares cercanos</w:t>
+              <w:t>Servicios, sistemas y políticas de seguridad social</w:t>
             </w:r>
           </w:p>
         </w:tc>
@@ -7609,7 +7609,7 @@
                 <w:rFonts w:ascii="Times New Roman" w:hAnsi="Times New Roman"/>
                 <w:sz w:val="15"/>
               </w:rPr>
-              <w:t>0</w:t>
+              <w:t>5</w:t>
             </w:r>
           </w:p>
         </w:tc>
@@ -7633,7 +7633,7 @@
                 <w:rFonts w:ascii="Times New Roman" w:hAnsi="Times New Roman"/>
                 <w:sz w:val="15"/>
               </w:rPr>
-              <w:t>0.00</w:t>
+              <w:t>0.75</w:t>
             </w:r>
           </w:p>
         </w:tc>
@@ -7657,7 +7657,7 @@
                 <w:rFonts w:ascii="Times New Roman" w:hAnsi="Times New Roman"/>
                 <w:sz w:val="15"/>
               </w:rPr>
-              <w:t>0.00</w:t>
+              <w:t>0.57</w:t>
             </w:r>
           </w:p>
         </w:tc>
@@ -7681,523 +7681,7 @@
                 <w:rFonts w:ascii="Times New Roman" w:hAnsi="Times New Roman"/>
                 <w:sz w:val="15"/>
               </w:rPr>
-              <w:t>0.00</w:t>
-            </w:r>
-          </w:p>
-        </w:tc>
-      </w:tr>
-      <w:tr>
-        <w:tc>
-          <w:tcPr>
-            <w:tcW w:type="dxa" w:w="2160"/>
-            <w:tcMar>
-              <w:top w:w="20" w:type="dxa"/>
-              <w:bottom w:w="20" w:type="dxa"/>
-              <w:left w:w="25" w:type="dxa"/>
-              <w:right w:w="25" w:type="dxa"/>
-            </w:tcMar>
-          </w:tcPr>
-          <w:p>
-            <w:pPr>
-              <w:spacing w:line="240" w:lineRule="auto" w:after="20"/>
-              <w:jc w:val="left"/>
-            </w:pPr>
-            <w:r>
-              <w:rPr>
-                <w:rFonts w:ascii="Times New Roman" w:hAnsi="Times New Roman"/>
-                <w:i/>
-                <w:sz w:val="15"/>
-              </w:rPr>
-              <w:t>Factores Ambientales</w:t>
-            </w:r>
-          </w:p>
-        </w:tc>
-        <w:tc>
-          <w:tcPr>
-            <w:tcW w:type="dxa" w:w="936"/>
-            <w:tcMar>
-              <w:top w:w="20" w:type="dxa"/>
-              <w:bottom w:w="20" w:type="dxa"/>
-              <w:left w:w="25" w:type="dxa"/>
-              <w:right w:w="25" w:type="dxa"/>
-            </w:tcMar>
-          </w:tcPr>
-          <w:p>
-            <w:pPr>
-              <w:spacing w:line="240" w:lineRule="auto" w:after="20"/>
-              <w:jc w:val="left"/>
-            </w:pPr>
-            <w:r>
-              <w:rPr>
-                <w:rFonts w:ascii="Times New Roman" w:hAnsi="Times New Roman"/>
-                <w:b/>
-                <w:sz w:val="15"/>
-              </w:rPr>
-              <w:t>e355</w:t>
-            </w:r>
-          </w:p>
-        </w:tc>
-        <w:tc>
-          <w:tcPr>
-            <w:tcW w:type="dxa" w:w="3312"/>
-            <w:tcMar>
-              <w:top w:w="20" w:type="dxa"/>
-              <w:bottom w:w="20" w:type="dxa"/>
-              <w:left w:w="25" w:type="dxa"/>
-              <w:right w:w="25" w:type="dxa"/>
-            </w:tcMar>
-          </w:tcPr>
-          <w:p>
-            <w:pPr>
-              <w:spacing w:line="240" w:lineRule="auto" w:after="20"/>
-              <w:jc w:val="left"/>
-            </w:pPr>
-            <w:r>
-              <w:rPr>
-                <w:rFonts w:ascii="Times New Roman" w:hAnsi="Times New Roman"/>
-                <w:sz w:val="15"/>
-              </w:rPr>
-              <w:t>Profesionales de la salud</w:t>
-            </w:r>
-          </w:p>
-        </w:tc>
-        <w:tc>
-          <w:tcPr>
-            <w:tcW w:type="dxa" w:w="936"/>
-            <w:tcMar>
-              <w:top w:w="20" w:type="dxa"/>
-              <w:bottom w:w="20" w:type="dxa"/>
-              <w:left w:w="25" w:type="dxa"/>
-              <w:right w:w="25" w:type="dxa"/>
-            </w:tcMar>
-          </w:tcPr>
-          <w:p>
-            <w:pPr>
-              <w:spacing w:line="240" w:lineRule="auto" w:after="20"/>
-              <w:jc w:val="center"/>
-            </w:pPr>
-            <w:r>
-              <w:rPr>
-                <w:rFonts w:ascii="Times New Roman" w:hAnsi="Times New Roman"/>
-                <w:sz w:val="15"/>
-              </w:rPr>
-              <w:t>2</w:t>
-            </w:r>
-          </w:p>
-        </w:tc>
-        <w:tc>
-          <w:tcPr>
-            <w:tcW w:type="dxa" w:w="1224"/>
-            <w:tcMar>
-              <w:top w:w="20" w:type="dxa"/>
-              <w:bottom w:w="20" w:type="dxa"/>
-              <w:left w:w="25" w:type="dxa"/>
-              <w:right w:w="25" w:type="dxa"/>
-            </w:tcMar>
-          </w:tcPr>
-          <w:p>
-            <w:pPr>
-              <w:spacing w:line="240" w:lineRule="auto" w:after="20"/>
-              <w:jc w:val="center"/>
-            </w:pPr>
-            <w:r>
-              <w:rPr>
-                <w:rFonts w:ascii="Times New Roman" w:hAnsi="Times New Roman"/>
-                <w:sz w:val="15"/>
-              </w:rPr>
               <w:t>0.57</w:t>
-            </w:r>
-          </w:p>
-        </w:tc>
-        <w:tc>
-          <w:tcPr>
-            <w:tcW w:type="dxa" w:w="1224"/>
-            <w:tcMar>
-              <w:top w:w="20" w:type="dxa"/>
-              <w:bottom w:w="20" w:type="dxa"/>
-              <w:left w:w="25" w:type="dxa"/>
-              <w:right w:w="25" w:type="dxa"/>
-            </w:tcMar>
-          </w:tcPr>
-          <w:p>
-            <w:pPr>
-              <w:spacing w:line="240" w:lineRule="auto" w:after="20"/>
-              <w:jc w:val="center"/>
-            </w:pPr>
-            <w:r>
-              <w:rPr>
-                <w:rFonts w:ascii="Times New Roman" w:hAnsi="Times New Roman"/>
-                <w:sz w:val="15"/>
-              </w:rPr>
-              <w:t>0.50</w:t>
-            </w:r>
-          </w:p>
-        </w:tc>
-        <w:tc>
-          <w:tcPr>
-            <w:tcW w:type="dxa" w:w="1224"/>
-            <w:tcMar>
-              <w:top w:w="20" w:type="dxa"/>
-              <w:bottom w:w="20" w:type="dxa"/>
-              <w:left w:w="25" w:type="dxa"/>
-              <w:right w:w="25" w:type="dxa"/>
-            </w:tcMar>
-          </w:tcPr>
-          <w:p>
-            <w:pPr>
-              <w:spacing w:line="240" w:lineRule="auto" w:after="20"/>
-              <w:jc w:val="center"/>
-            </w:pPr>
-            <w:r>
-              <w:rPr>
-                <w:rFonts w:ascii="Times New Roman" w:hAnsi="Times New Roman"/>
-                <w:sz w:val="15"/>
-              </w:rPr>
-              <w:t>0.50</w:t>
-            </w:r>
-          </w:p>
-        </w:tc>
-      </w:tr>
-      <w:tr>
-        <w:tc>
-          <w:tcPr>
-            <w:tcW w:type="dxa" w:w="2160"/>
-            <w:tcMar>
-              <w:top w:w="20" w:type="dxa"/>
-              <w:bottom w:w="20" w:type="dxa"/>
-              <w:left w:w="25" w:type="dxa"/>
-              <w:right w:w="25" w:type="dxa"/>
-            </w:tcMar>
-          </w:tcPr>
-          <w:p>
-            <w:pPr>
-              <w:spacing w:line="240" w:lineRule="auto" w:after="20"/>
-              <w:jc w:val="left"/>
-            </w:pPr>
-            <w:r>
-              <w:rPr>
-                <w:rFonts w:ascii="Times New Roman" w:hAnsi="Times New Roman"/>
-                <w:i/>
-                <w:sz w:val="15"/>
-              </w:rPr>
-              <w:t>Factores Ambientales</w:t>
-            </w:r>
-          </w:p>
-        </w:tc>
-        <w:tc>
-          <w:tcPr>
-            <w:tcW w:type="dxa" w:w="936"/>
-            <w:tcMar>
-              <w:top w:w="20" w:type="dxa"/>
-              <w:bottom w:w="20" w:type="dxa"/>
-              <w:left w:w="25" w:type="dxa"/>
-              <w:right w:w="25" w:type="dxa"/>
-            </w:tcMar>
-          </w:tcPr>
-          <w:p>
-            <w:pPr>
-              <w:spacing w:line="240" w:lineRule="auto" w:after="20"/>
-              <w:jc w:val="left"/>
-            </w:pPr>
-            <w:r>
-              <w:rPr>
-                <w:rFonts w:ascii="Times New Roman" w:hAnsi="Times New Roman"/>
-                <w:b/>
-                <w:sz w:val="15"/>
-              </w:rPr>
-              <w:t>e410</w:t>
-            </w:r>
-          </w:p>
-        </w:tc>
-        <w:tc>
-          <w:tcPr>
-            <w:tcW w:type="dxa" w:w="3312"/>
-            <w:tcMar>
-              <w:top w:w="20" w:type="dxa"/>
-              <w:bottom w:w="20" w:type="dxa"/>
-              <w:left w:w="25" w:type="dxa"/>
-              <w:right w:w="25" w:type="dxa"/>
-            </w:tcMar>
-          </w:tcPr>
-          <w:p>
-            <w:pPr>
-              <w:spacing w:line="240" w:lineRule="auto" w:after="20"/>
-              <w:jc w:val="left"/>
-            </w:pPr>
-            <w:r>
-              <w:rPr>
-                <w:rFonts w:ascii="Times New Roman" w:hAnsi="Times New Roman"/>
-                <w:sz w:val="15"/>
-              </w:rPr>
-              <w:t>Actitudes individuales de miembros de la familia cercana</w:t>
-            </w:r>
-          </w:p>
-        </w:tc>
-        <w:tc>
-          <w:tcPr>
-            <w:tcW w:type="dxa" w:w="936"/>
-            <w:tcMar>
-              <w:top w:w="20" w:type="dxa"/>
-              <w:bottom w:w="20" w:type="dxa"/>
-              <w:left w:w="25" w:type="dxa"/>
-              <w:right w:w="25" w:type="dxa"/>
-            </w:tcMar>
-          </w:tcPr>
-          <w:p>
-            <w:pPr>
-              <w:spacing w:line="240" w:lineRule="auto" w:after="20"/>
-              <w:jc w:val="center"/>
-            </w:pPr>
-            <w:r>
-              <w:rPr>
-                <w:rFonts w:ascii="Times New Roman" w:hAnsi="Times New Roman"/>
-                <w:sz w:val="15"/>
-              </w:rPr>
-              <w:t>1</w:t>
-            </w:r>
-          </w:p>
-        </w:tc>
-        <w:tc>
-          <w:tcPr>
-            <w:tcW w:type="dxa" w:w="1224"/>
-            <w:tcMar>
-              <w:top w:w="20" w:type="dxa"/>
-              <w:bottom w:w="20" w:type="dxa"/>
-              <w:left w:w="25" w:type="dxa"/>
-              <w:right w:w="25" w:type="dxa"/>
-            </w:tcMar>
-          </w:tcPr>
-          <w:p>
-            <w:pPr>
-              <w:spacing w:line="240" w:lineRule="auto" w:after="20"/>
-              <w:jc w:val="center"/>
-            </w:pPr>
-            <w:r>
-              <w:rPr>
-                <w:rFonts w:ascii="Times New Roman" w:hAnsi="Times New Roman"/>
-                <w:sz w:val="15"/>
-              </w:rPr>
-              <w:t>0.00</w:t>
-            </w:r>
-          </w:p>
-        </w:tc>
-        <w:tc>
-          <w:tcPr>
-            <w:tcW w:type="dxa" w:w="1224"/>
-            <w:tcMar>
-              <w:top w:w="20" w:type="dxa"/>
-              <w:bottom w:w="20" w:type="dxa"/>
-              <w:left w:w="25" w:type="dxa"/>
-              <w:right w:w="25" w:type="dxa"/>
-            </w:tcMar>
-          </w:tcPr>
-          <w:p>
-            <w:pPr>
-              <w:spacing w:line="240" w:lineRule="auto" w:after="20"/>
-              <w:jc w:val="center"/>
-            </w:pPr>
-            <w:r>
-              <w:rPr>
-                <w:rFonts w:ascii="Times New Roman" w:hAnsi="Times New Roman"/>
-                <w:sz w:val="15"/>
-              </w:rPr>
-              <w:t>0.00</w:t>
-            </w:r>
-          </w:p>
-        </w:tc>
-        <w:tc>
-          <w:tcPr>
-            <w:tcW w:type="dxa" w:w="1224"/>
-            <w:tcMar>
-              <w:top w:w="20" w:type="dxa"/>
-              <w:bottom w:w="20" w:type="dxa"/>
-              <w:left w:w="25" w:type="dxa"/>
-              <w:right w:w="25" w:type="dxa"/>
-            </w:tcMar>
-          </w:tcPr>
-          <w:p>
-            <w:pPr>
-              <w:spacing w:line="240" w:lineRule="auto" w:after="20"/>
-              <w:jc w:val="center"/>
-            </w:pPr>
-            <w:r>
-              <w:rPr>
-                <w:rFonts w:ascii="Times New Roman" w:hAnsi="Times New Roman"/>
-                <w:sz w:val="15"/>
-              </w:rPr>
-              <w:t>0.00</w:t>
-            </w:r>
-          </w:p>
-        </w:tc>
-      </w:tr>
-      <w:tr>
-        <w:tc>
-          <w:tcPr>
-            <w:tcW w:type="dxa" w:w="2160"/>
-            <w:tcMar>
-              <w:top w:w="20" w:type="dxa"/>
-              <w:bottom w:w="20" w:type="dxa"/>
-              <w:left w:w="25" w:type="dxa"/>
-              <w:right w:w="25" w:type="dxa"/>
-            </w:tcMar>
-          </w:tcPr>
-          <w:p>
-            <w:pPr>
-              <w:spacing w:line="240" w:lineRule="auto" w:after="20"/>
-              <w:jc w:val="left"/>
-            </w:pPr>
-            <w:r>
-              <w:rPr>
-                <w:rFonts w:ascii="Times New Roman" w:hAnsi="Times New Roman"/>
-                <w:i/>
-                <w:sz w:val="15"/>
-              </w:rPr>
-              <w:t>Factores Ambientales</w:t>
-            </w:r>
-          </w:p>
-        </w:tc>
-        <w:tc>
-          <w:tcPr>
-            <w:tcW w:type="dxa" w:w="936"/>
-            <w:tcMar>
-              <w:top w:w="20" w:type="dxa"/>
-              <w:bottom w:w="20" w:type="dxa"/>
-              <w:left w:w="25" w:type="dxa"/>
-              <w:right w:w="25" w:type="dxa"/>
-            </w:tcMar>
-          </w:tcPr>
-          <w:p>
-            <w:pPr>
-              <w:spacing w:line="240" w:lineRule="auto" w:after="20"/>
-              <w:jc w:val="left"/>
-            </w:pPr>
-            <w:r>
-              <w:rPr>
-                <w:rFonts w:ascii="Times New Roman" w:hAnsi="Times New Roman"/>
-                <w:b/>
-                <w:sz w:val="15"/>
-              </w:rPr>
-              <w:t>e570</w:t>
-            </w:r>
-          </w:p>
-        </w:tc>
-        <w:tc>
-          <w:tcPr>
-            <w:tcW w:type="dxa" w:w="3312"/>
-            <w:tcMar>
-              <w:top w:w="20" w:type="dxa"/>
-              <w:bottom w:w="20" w:type="dxa"/>
-              <w:left w:w="25" w:type="dxa"/>
-              <w:right w:w="25" w:type="dxa"/>
-            </w:tcMar>
-          </w:tcPr>
-          <w:p>
-            <w:pPr>
-              <w:spacing w:line="240" w:lineRule="auto" w:after="20"/>
-              <w:jc w:val="left"/>
-            </w:pPr>
-            <w:r>
-              <w:rPr>
-                <w:rFonts w:ascii="Times New Roman" w:hAnsi="Times New Roman"/>
-                <w:sz w:val="15"/>
-              </w:rPr>
-              <w:t>Servicios, sistemas y políticas de seguridad social</w:t>
-            </w:r>
-          </w:p>
-        </w:tc>
-        <w:tc>
-          <w:tcPr>
-            <w:tcW w:type="dxa" w:w="936"/>
-            <w:tcMar>
-              <w:top w:w="20" w:type="dxa"/>
-              <w:bottom w:w="20" w:type="dxa"/>
-              <w:left w:w="25" w:type="dxa"/>
-              <w:right w:w="25" w:type="dxa"/>
-            </w:tcMar>
-          </w:tcPr>
-          <w:p>
-            <w:pPr>
-              <w:spacing w:line="240" w:lineRule="auto" w:after="20"/>
-              <w:jc w:val="center"/>
-            </w:pPr>
-            <w:r>
-              <w:rPr>
-                <w:rFonts w:ascii="Times New Roman" w:hAnsi="Times New Roman"/>
-                <w:sz w:val="15"/>
-              </w:rPr>
-              <w:t>5</w:t>
-            </w:r>
-          </w:p>
-        </w:tc>
-        <w:tc>
-          <w:tcPr>
-            <w:tcW w:type="dxa" w:w="1224"/>
-            <w:tcMar>
-              <w:top w:w="20" w:type="dxa"/>
-              <w:bottom w:w="20" w:type="dxa"/>
-              <w:left w:w="25" w:type="dxa"/>
-              <w:right w:w="25" w:type="dxa"/>
-            </w:tcMar>
-          </w:tcPr>
-          <w:p>
-            <w:pPr>
-              <w:spacing w:line="240" w:lineRule="auto" w:after="20"/>
-              <w:jc w:val="center"/>
-            </w:pPr>
-            <w:r>
-              <w:rPr>
-                <w:rFonts w:ascii="Times New Roman" w:hAnsi="Times New Roman"/>
-                <w:sz w:val="15"/>
-              </w:rPr>
-              <w:t>0.75</w:t>
-            </w:r>
-          </w:p>
-        </w:tc>
-        <w:tc>
-          <w:tcPr>
-            <w:tcW w:type="dxa" w:w="1224"/>
-            <w:tcMar>
-              <w:top w:w="20" w:type="dxa"/>
-              <w:bottom w:w="20" w:type="dxa"/>
-              <w:left w:w="25" w:type="dxa"/>
-              <w:right w:w="25" w:type="dxa"/>
-            </w:tcMar>
-          </w:tcPr>
-          <w:p>
-            <w:pPr>
-              <w:spacing w:line="240" w:lineRule="auto" w:after="20"/>
-              <w:jc w:val="center"/>
-            </w:pPr>
-            <w:r>
-              <w:rPr>
-                <w:rFonts w:ascii="Times New Roman" w:hAnsi="Times New Roman"/>
-                <w:sz w:val="15"/>
-              </w:rPr>
-              <w:t>0.75</w:t>
-            </w:r>
-          </w:p>
-        </w:tc>
-        <w:tc>
-          <w:tcPr>
-            <w:tcW w:type="dxa" w:w="1224"/>
-            <w:tcMar>
-              <w:top w:w="20" w:type="dxa"/>
-              <w:bottom w:w="20" w:type="dxa"/>
-              <w:left w:w="25" w:type="dxa"/>
-              <w:right w:w="25" w:type="dxa"/>
-            </w:tcMar>
-          </w:tcPr>
-          <w:p>
-            <w:pPr>
-              <w:spacing w:line="240" w:lineRule="auto" w:after="20"/>
-              <w:jc w:val="center"/>
-            </w:pPr>
-            <w:r>
-              <w:rPr>
-                <w:rFonts w:ascii="Times New Roman" w:hAnsi="Times New Roman"/>
-                <w:sz w:val="15"/>
-              </w:rPr>
-              <w:t>0.75</w:t>
             </w:r>
           </w:p>
         </w:tc>
@@ -8397,7 +7881,7 @@
           <w:rFonts w:ascii="Times New Roman" w:hAnsi="Times New Roman"/>
           <w:sz w:val="24"/>
         </w:rPr>
-        <w:t>La comparación entre el rendimiento sintético (N = 114) y el corpus de fisioterapeutas (N = 21) demuestra una alta tasa de retención (Tabla 3 y Figura 5): Gemini Flash 3.6 retuvo el 84.5% de su Micro-F1 (0.8208 vs 0.9709) y el 95.0% de su Precisión (0.9255 vs 0.9740). Gemini Flash 3.5 retuvo el 83.5% de su Micro-F1 y el 93.9% de su Precisión. Gemma-4-31B-it retuvo el 79.6% de su Micro-F1 y el 84.5% de su Precisión. La reducción en EMR se explica por la alta densidad diagnóstica de las historias reales, donde la omisión de un único código anula el acierto estricto del caso completo.</w:t>
+        <w:t>La comparación entre el rendimiento sintético (N = 114) y el corpus de fisioterapeutas (N = 21) demuestra una alta tasa de retención (Tabla 3 y Figura 5): Gemini Flash 3.7 retuvo el 72.2% de su Micro-F1 (0.7115 vs 0.9849) y el 80.8% de su Precisión (0.7957 vs 0.9849). Gemini Flash 3.5 retuvo el 69.2% de su Micro-F1 y el 76.2% de su Precisión. Gemma-4-31B-it retuvo el 78.9% de su Micro-F1 y el 83.1% de su Precisión. La reducción en EMR se explica por la alta densidad diagnóstica de las historias reales, donde la omisión de un único código anula el acierto estricto del caso completo.</w:t>
       </w:r>
     </w:p>
     <w:p>
@@ -8669,7 +8153,7 @@
                 <w:b/>
                 <w:sz w:val="15"/>
               </w:rPr>
-              <w:t>Flash 3.6 (Sint.)</w:t>
+              <w:t>Flash 3.7 (Sint.)</w:t>
             </w:r>
           </w:p>
         </w:tc>
@@ -8698,7 +8182,7 @@
                 <w:b/>
                 <w:sz w:val="15"/>
               </w:rPr>
-              <w:t>Flash 3.6 (Hum.)</w:t>
+              <w:t>Flash 3.7 (Hum.)</w:t>
             </w:r>
           </w:p>
         </w:tc>
@@ -8777,7 +8261,7 @@
                 <w:rFonts w:ascii="Times New Roman" w:hAnsi="Times New Roman"/>
                 <w:sz w:val="15"/>
               </w:rPr>
-              <w:t>82.46%</w:t>
+              <w:t>86.84%</w:t>
             </w:r>
           </w:p>
         </w:tc>
@@ -8825,7 +8309,7 @@
                 <w:rFonts w:ascii="Times New Roman" w:hAnsi="Times New Roman"/>
                 <w:sz w:val="15"/>
               </w:rPr>
-              <w:t>23.1%</w:t>
+              <w:t>21.9%</w:t>
             </w:r>
           </w:p>
         </w:tc>
@@ -8849,7 +8333,7 @@
                 <w:rFonts w:ascii="Times New Roman" w:hAnsi="Times New Roman"/>
                 <w:sz w:val="15"/>
               </w:rPr>
-              <w:t>85.09%</w:t>
+              <w:t>87.72%</w:t>
             </w:r>
           </w:p>
         </w:tc>
@@ -8873,7 +8357,7 @@
                 <w:rFonts w:ascii="Times New Roman" w:hAnsi="Times New Roman"/>
                 <w:sz w:val="15"/>
               </w:rPr>
-              <w:t>38.10%</w:t>
+              <w:t>4.76%</w:t>
             </w:r>
           </w:p>
         </w:tc>
@@ -8897,7 +8381,7 @@
                 <w:rFonts w:ascii="Times New Roman" w:hAnsi="Times New Roman"/>
                 <w:sz w:val="15"/>
               </w:rPr>
-              <w:t>44.8%</w:t>
+              <w:t>5.4%</w:t>
             </w:r>
           </w:p>
         </w:tc>
@@ -8921,7 +8405,7 @@
                 <w:rFonts w:ascii="Times New Roman" w:hAnsi="Times New Roman"/>
                 <w:sz w:val="15"/>
               </w:rPr>
-              <w:t>84.21%</w:t>
+              <w:t>89.47%</w:t>
             </w:r>
           </w:p>
         </w:tc>
@@ -8945,7 +8429,7 @@
                 <w:rFonts w:ascii="Times New Roman" w:hAnsi="Times New Roman"/>
                 <w:sz w:val="15"/>
               </w:rPr>
-              <w:t>33.33%</w:t>
+              <w:t>9.52%</w:t>
             </w:r>
           </w:p>
         </w:tc>
@@ -8969,7 +8453,7 @@
                 <w:rFonts w:ascii="Times New Roman" w:hAnsi="Times New Roman"/>
                 <w:sz w:val="15"/>
               </w:rPr>
-              <w:t>39.6%</w:t>
+              <w:t>10.6%</w:t>
             </w:r>
           </w:p>
         </w:tc>
@@ -9019,7 +8503,7 @@
                 <w:rFonts w:ascii="Times New Roman" w:hAnsi="Times New Roman"/>
                 <w:sz w:val="15"/>
               </w:rPr>
-              <w:t>0.9698</w:t>
+              <w:t>0.9745</w:t>
             </w:r>
           </w:p>
         </w:tc>
@@ -9043,7 +8527,7 @@
                 <w:rFonts w:ascii="Times New Roman" w:hAnsi="Times New Roman"/>
                 <w:sz w:val="15"/>
               </w:rPr>
-              <w:t>0.8190</w:t>
+              <w:t>0.8095</w:t>
             </w:r>
           </w:p>
         </w:tc>
@@ -9067,7 +8551,7 @@
                 <w:rFonts w:ascii="Times New Roman" w:hAnsi="Times New Roman"/>
                 <w:sz w:val="15"/>
               </w:rPr>
-              <w:t>84.5%</w:t>
+              <w:t>83.1%</w:t>
             </w:r>
           </w:p>
         </w:tc>
@@ -9091,7 +8575,7 @@
                 <w:rFonts w:ascii="Times New Roman" w:hAnsi="Times New Roman"/>
                 <w:sz w:val="15"/>
               </w:rPr>
-              <w:t>0.9741</w:t>
+              <w:t>0.9746</w:t>
             </w:r>
           </w:p>
         </w:tc>
@@ -9115,7 +8599,7 @@
                 <w:rFonts w:ascii="Times New Roman" w:hAnsi="Times New Roman"/>
                 <w:sz w:val="15"/>
               </w:rPr>
-              <w:t>0.9149</w:t>
+              <w:t>0.7423</w:t>
             </w:r>
           </w:p>
         </w:tc>
@@ -9139,7 +8623,7 @@
                 <w:rFonts w:ascii="Times New Roman" w:hAnsi="Times New Roman"/>
                 <w:sz w:val="15"/>
               </w:rPr>
-              <w:t>93.9%</w:t>
+              <w:t>76.2%</w:t>
             </w:r>
           </w:p>
         </w:tc>
@@ -9163,7 +8647,7 @@
                 <w:rFonts w:ascii="Times New Roman" w:hAnsi="Times New Roman"/>
                 <w:sz w:val="15"/>
               </w:rPr>
-              <w:t>0.9740</w:t>
+              <w:t>0.9849</w:t>
             </w:r>
           </w:p>
         </w:tc>
@@ -9187,7 +8671,7 @@
                 <w:rFonts w:ascii="Times New Roman" w:hAnsi="Times New Roman"/>
                 <w:sz w:val="15"/>
               </w:rPr>
-              <w:t>0.9255</w:t>
+              <w:t>0.7957</w:t>
             </w:r>
           </w:p>
         </w:tc>
@@ -9211,7 +8695,7 @@
                 <w:rFonts w:ascii="Times New Roman" w:hAnsi="Times New Roman"/>
                 <w:sz w:val="15"/>
               </w:rPr>
-              <w:t>95.0%</w:t>
+              <w:t>80.8%</w:t>
             </w:r>
           </w:p>
         </w:tc>
@@ -9261,7 +8745,7 @@
                 <w:rFonts w:ascii="Times New Roman" w:hAnsi="Times New Roman"/>
                 <w:sz w:val="15"/>
               </w:rPr>
-              <w:t>0.9677</w:t>
+              <w:t>0.9849</w:t>
             </w:r>
           </w:p>
         </w:tc>
@@ -9285,7 +8769,7 @@
                 <w:rFonts w:ascii="Times New Roman" w:hAnsi="Times New Roman"/>
                 <w:sz w:val="15"/>
               </w:rPr>
-              <w:t>0.7288</w:t>
+              <w:t>0.7391</w:t>
             </w:r>
           </w:p>
         </w:tc>
@@ -9309,7 +8793,7 @@
                 <w:rFonts w:ascii="Times New Roman" w:hAnsi="Times New Roman"/>
                 <w:sz w:val="15"/>
               </w:rPr>
-              <w:t>75.3%</w:t>
+              <w:t>75.0%</w:t>
             </w:r>
           </w:p>
         </w:tc>
@@ -9333,7 +8817,7 @@
                 <w:rFonts w:ascii="Times New Roman" w:hAnsi="Times New Roman"/>
                 <w:sz w:val="15"/>
               </w:rPr>
-              <w:t>0.9699</w:t>
+              <w:t>0.9892</w:t>
             </w:r>
           </w:p>
         </w:tc>
@@ -9357,7 +8841,7 @@
                 <w:rFonts w:ascii="Times New Roman" w:hAnsi="Times New Roman"/>
                 <w:sz w:val="15"/>
               </w:rPr>
-              <w:t>0.7288</w:t>
+              <w:t>0.6261</w:t>
             </w:r>
           </w:p>
         </w:tc>
@@ -9381,7 +8865,7 @@
                 <w:rFonts w:ascii="Times New Roman" w:hAnsi="Times New Roman"/>
                 <w:sz w:val="15"/>
               </w:rPr>
-              <w:t>75.1%</w:t>
+              <w:t>63.3%</w:t>
             </w:r>
           </w:p>
         </w:tc>
@@ -9405,7 +8889,7 @@
                 <w:rFonts w:ascii="Times New Roman" w:hAnsi="Times New Roman"/>
                 <w:sz w:val="15"/>
               </w:rPr>
-              <w:t>0.9677</w:t>
+              <w:t>0.9849</w:t>
             </w:r>
           </w:p>
         </w:tc>
@@ -9429,7 +8913,7 @@
                 <w:rFonts w:ascii="Times New Roman" w:hAnsi="Times New Roman"/>
                 <w:sz w:val="15"/>
               </w:rPr>
-              <w:t>0.7373</w:t>
+              <w:t>0.6435</w:t>
             </w:r>
           </w:p>
         </w:tc>
@@ -9453,7 +8937,7 @@
                 <w:rFonts w:ascii="Times New Roman" w:hAnsi="Times New Roman"/>
                 <w:sz w:val="15"/>
               </w:rPr>
-              <w:t>76.2%</w:t>
+              <w:t>65.3%</w:t>
             </w:r>
           </w:p>
         </w:tc>
@@ -9503,7 +8987,7 @@
                 <w:rFonts w:ascii="Times New Roman" w:hAnsi="Times New Roman"/>
                 <w:sz w:val="15"/>
               </w:rPr>
-              <w:t>0.9688</w:t>
+              <w:t>0.9797</w:t>
             </w:r>
           </w:p>
         </w:tc>
@@ -9527,7 +9011,7 @@
                 <w:rFonts w:ascii="Times New Roman" w:hAnsi="Times New Roman"/>
                 <w:sz w:val="15"/>
               </w:rPr>
-              <w:t>0.7713</w:t>
+              <w:t>0.7727</w:t>
             </w:r>
           </w:p>
         </w:tc>
@@ -9551,7 +9035,7 @@
                 <w:rFonts w:ascii="Times New Roman" w:hAnsi="Times New Roman"/>
                 <w:sz w:val="15"/>
               </w:rPr>
-              <w:t>79.6%</w:t>
+              <w:t>78.9%</w:t>
             </w:r>
           </w:p>
         </w:tc>
@@ -9575,7 +9059,7 @@
                 <w:rFonts w:ascii="Times New Roman" w:hAnsi="Times New Roman"/>
                 <w:sz w:val="15"/>
               </w:rPr>
-              <w:t>0.9720</w:t>
+              <w:t>0.9819</w:t>
             </w:r>
           </w:p>
         </w:tc>
@@ -9599,7 +9083,7 @@
                 <w:rFonts w:ascii="Times New Roman" w:hAnsi="Times New Roman"/>
                 <w:sz w:val="15"/>
               </w:rPr>
-              <w:t>0.8113</w:t>
+              <w:t>0.6792</w:t>
             </w:r>
           </w:p>
         </w:tc>
@@ -9623,7 +9107,7 @@
                 <w:rFonts w:ascii="Times New Roman" w:hAnsi="Times New Roman"/>
                 <w:sz w:val="15"/>
               </w:rPr>
-              <w:t>83.5%</w:t>
+              <w:t>69.2%</w:t>
             </w:r>
           </w:p>
         </w:tc>
@@ -9647,7 +9131,7 @@
                 <w:rFonts w:ascii="Times New Roman" w:hAnsi="Times New Roman"/>
                 <w:sz w:val="15"/>
               </w:rPr>
-              <w:t>0.9709</w:t>
+              <w:t>0.9849</w:t>
             </w:r>
           </w:p>
         </w:tc>
@@ -9671,7 +9155,7 @@
                 <w:rFonts w:ascii="Times New Roman" w:hAnsi="Times New Roman"/>
                 <w:sz w:val="15"/>
               </w:rPr>
-              <w:t>0.8208</w:t>
+              <w:t>0.7115</w:t>
             </w:r>
           </w:p>
         </w:tc>
@@ -9695,7 +9179,7 @@
                 <w:rFonts w:ascii="Times New Roman" w:hAnsi="Times New Roman"/>
                 <w:sz w:val="15"/>
               </w:rPr>
-              <w:t>84.5%</w:t>
+              <w:t>72.2%</w:t>
             </w:r>
           </w:p>
         </w:tc>
@@ -9745,7 +9229,7 @@
                 <w:rFonts w:ascii="Times New Roman" w:hAnsi="Times New Roman"/>
                 <w:sz w:val="15"/>
               </w:rPr>
-              <w:t>0.8621</w:t>
+              <w:t>0.9731</w:t>
             </w:r>
           </w:p>
         </w:tc>
@@ -9769,7 +9253,7 @@
                 <w:rFonts w:ascii="Times New Roman" w:hAnsi="Times New Roman"/>
                 <w:sz w:val="15"/>
               </w:rPr>
-              <w:t>0.5117</w:t>
+              <w:t>0.5548</w:t>
             </w:r>
           </w:p>
         </w:tc>
@@ -9793,7 +9277,7 @@
                 <w:rFonts w:ascii="Times New Roman" w:hAnsi="Times New Roman"/>
                 <w:sz w:val="15"/>
               </w:rPr>
-              <w:t>59.4%</w:t>
+              <w:t>57.0%</w:t>
             </w:r>
           </w:p>
         </w:tc>
@@ -9817,7 +9301,7 @@
                 <w:rFonts w:ascii="Times New Roman" w:hAnsi="Times New Roman"/>
                 <w:sz w:val="15"/>
               </w:rPr>
-              <w:t>0.8670</w:t>
+              <w:t>0.9768</w:t>
             </w:r>
           </w:p>
         </w:tc>
@@ -9841,7 +9325,7 @@
                 <w:rFonts w:ascii="Times New Roman" w:hAnsi="Times New Roman"/>
                 <w:sz w:val="15"/>
               </w:rPr>
-              <w:t>0.5421</w:t>
+              <w:t>0.4581</w:t>
             </w:r>
           </w:p>
         </w:tc>
@@ -9865,7 +9349,7 @@
                 <w:rFonts w:ascii="Times New Roman" w:hAnsi="Times New Roman"/>
                 <w:sz w:val="15"/>
               </w:rPr>
-              <w:t>62.5%</w:t>
+              <w:t>46.9%</w:t>
             </w:r>
           </w:p>
         </w:tc>
@@ -9889,7 +9373,7 @@
                 <w:rFonts w:ascii="Times New Roman" w:hAnsi="Times New Roman"/>
                 <w:sz w:val="15"/>
               </w:rPr>
-              <w:t>0.8650</w:t>
+              <w:t>0.9789</w:t>
             </w:r>
           </w:p>
         </w:tc>
@@ -9913,7 +9397,7 @@
                 <w:rFonts w:ascii="Times New Roman" w:hAnsi="Times New Roman"/>
                 <w:sz w:val="15"/>
               </w:rPr>
-              <w:t>0.5537</w:t>
+              <w:t>0.4683</w:t>
             </w:r>
           </w:p>
         </w:tc>
@@ -9937,7 +9421,7 @@
                 <w:rFonts w:ascii="Times New Roman" w:hAnsi="Times New Roman"/>
                 <w:sz w:val="15"/>
               </w:rPr>
-              <w:t>64.0%</w:t>
+              <w:t>47.8%</w:t>
             </w:r>
           </w:p>
         </w:tc>
@@ -9987,7 +9471,7 @@
                 <w:rFonts w:ascii="Times New Roman" w:hAnsi="Times New Roman"/>
                 <w:sz w:val="15"/>
               </w:rPr>
-              <w:t>0.9597</w:t>
+              <w:t>0.9794</w:t>
             </w:r>
           </w:p>
         </w:tc>
@@ -10011,7 +9495,7 @@
                 <w:rFonts w:ascii="Times New Roman" w:hAnsi="Times New Roman"/>
                 <w:sz w:val="15"/>
               </w:rPr>
-              <w:t>0.7550</w:t>
+              <w:t>0.7617</w:t>
             </w:r>
           </w:p>
         </w:tc>
@@ -10035,7 +9519,7 @@
                 <w:rFonts w:ascii="Times New Roman" w:hAnsi="Times New Roman"/>
                 <w:sz w:val="15"/>
               </w:rPr>
-              <w:t>78.7%</w:t>
+              <w:t>77.8%</w:t>
             </w:r>
           </w:p>
         </w:tc>
@@ -10059,7 +9543,7 @@
                 <w:rFonts w:ascii="Times New Roman" w:hAnsi="Times New Roman"/>
                 <w:sz w:val="15"/>
               </w:rPr>
-              <w:t>0.9631</w:t>
+              <w:t>0.9819</w:t>
             </w:r>
           </w:p>
         </w:tc>
@@ -10083,7 +9567,7 @@
                 <w:rFonts w:ascii="Times New Roman" w:hAnsi="Times New Roman"/>
                 <w:sz w:val="15"/>
               </w:rPr>
-              <w:t>0.7817</w:t>
+              <w:t>0.6697</w:t>
             </w:r>
           </w:p>
         </w:tc>
@@ -10107,7 +9591,7 @@
                 <w:rFonts w:ascii="Times New Roman" w:hAnsi="Times New Roman"/>
                 <w:sz w:val="15"/>
               </w:rPr>
-              <w:t>81.2%</w:t>
+              <w:t>68.2%</w:t>
             </w:r>
           </w:p>
         </w:tc>
@@ -10131,7 +9615,7 @@
                 <w:rFonts w:ascii="Times New Roman" w:hAnsi="Times New Roman"/>
                 <w:sz w:val="15"/>
               </w:rPr>
-              <w:t>0.9617</w:t>
+              <w:t>0.9838</w:t>
             </w:r>
           </w:p>
         </w:tc>
@@ -10155,7 +9639,7 @@
                 <w:rFonts w:ascii="Times New Roman" w:hAnsi="Times New Roman"/>
                 <w:sz w:val="15"/>
               </w:rPr>
-              <w:t>0.7941</w:t>
+              <w:t>0.6799</w:t>
             </w:r>
           </w:p>
         </w:tc>
@@ -10179,7 +9663,7 @@
                 <w:rFonts w:ascii="Times New Roman" w:hAnsi="Times New Roman"/>
                 <w:sz w:val="15"/>
               </w:rPr>
-              <w:t>82.6%</w:t>
+              <w:t>69.1%</w:t>
             </w:r>
           </w:p>
         </w:tc>
@@ -10325,7 +9809,7 @@
                 <w:rFonts w:ascii="Times New Roman" w:hAnsi="Times New Roman"/>
                 <w:sz w:val="15"/>
               </w:rPr>
-              <w:t>57.14%</w:t>
+              <w:t>52.38%</w:t>
             </w:r>
           </w:p>
         </w:tc>
@@ -10349,7 +9833,7 @@
                 <w:rFonts w:ascii="Times New Roman" w:hAnsi="Times New Roman"/>
                 <w:sz w:val="15"/>
               </w:rPr>
-              <w:t>58.2%</w:t>
+              <w:t>53.3%</w:t>
             </w:r>
           </w:p>
         </w:tc>
@@ -10397,7 +9881,7 @@
                 <w:rFonts w:ascii="Times New Roman" w:hAnsi="Times New Roman"/>
                 <w:sz w:val="15"/>
               </w:rPr>
-              <w:t>85.71%</w:t>
+              <w:t>57.14%</w:t>
             </w:r>
           </w:p>
         </w:tc>
@@ -10421,7 +9905,7 @@
                 <w:rFonts w:ascii="Times New Roman" w:hAnsi="Times New Roman"/>
                 <w:sz w:val="15"/>
               </w:rPr>
-              <w:t>85.7%</w:t>
+              <w:t>57.1%</w:t>
             </w:r>
           </w:p>
         </w:tc>
@@ -10495,7 +9979,7 @@
                 <w:rFonts w:ascii="Times New Roman" w:hAnsi="Times New Roman"/>
                 <w:sz w:val="15"/>
               </w:rPr>
-              <w:t>0.9794</w:t>
+              <w:t>0.9758</w:t>
             </w:r>
           </w:p>
         </w:tc>
@@ -10519,7 +10003,7 @@
                 <w:rFonts w:ascii="Times New Roman" w:hAnsi="Times New Roman"/>
                 <w:sz w:val="15"/>
               </w:rPr>
-              <w:t>98.0%</w:t>
+              <w:t>97.6%</w:t>
             </w:r>
           </w:p>
         </w:tc>
@@ -10567,7 +10051,7 @@
                 <w:rFonts w:ascii="Times New Roman" w:hAnsi="Times New Roman"/>
                 <w:sz w:val="15"/>
               </w:rPr>
-              <w:t>0.9802</w:t>
+              <w:t>0.9724</w:t>
             </w:r>
           </w:p>
         </w:tc>
@@ -10591,7 +10075,7 @@
                 <w:rFonts w:ascii="Times New Roman" w:hAnsi="Times New Roman"/>
                 <w:sz w:val="15"/>
               </w:rPr>
-              <w:t>98.1%</w:t>
+              <w:t>97.3%</w:t>
             </w:r>
           </w:p>
         </w:tc>
@@ -10639,7 +10123,7 @@
                 <w:rFonts w:ascii="Times New Roman" w:hAnsi="Times New Roman"/>
                 <w:sz w:val="15"/>
               </w:rPr>
-              <w:t>0.9918</w:t>
+              <w:t>0.9708</w:t>
             </w:r>
           </w:p>
         </w:tc>
@@ -10663,7 +10147,7 @@
                 <w:rFonts w:ascii="Times New Roman" w:hAnsi="Times New Roman"/>
                 <w:sz w:val="15"/>
               </w:rPr>
-              <w:t>99.2%</w:t>
+              <w:t>97.1%</w:t>
             </w:r>
           </w:p>
         </w:tc>
@@ -10737,7 +10221,7 @@
                 <w:rFonts w:ascii="Times New Roman" w:hAnsi="Times New Roman"/>
                 <w:sz w:val="15"/>
               </w:rPr>
-              <w:t>0.9552</w:t>
+              <w:t>0.9538</w:t>
             </w:r>
           </w:p>
         </w:tc>
@@ -10761,7 +10245,7 @@
                 <w:rFonts w:ascii="Times New Roman" w:hAnsi="Times New Roman"/>
                 <w:sz w:val="15"/>
               </w:rPr>
-              <w:t>95.7%</w:t>
+              <w:t>95.5%</w:t>
             </w:r>
           </w:p>
         </w:tc>
@@ -10809,7 +10293,7 @@
                 <w:rFonts w:ascii="Times New Roman" w:hAnsi="Times New Roman"/>
                 <w:sz w:val="15"/>
               </w:rPr>
-              <w:t>0.9512</w:t>
+              <w:t>0.9439</w:t>
             </w:r>
           </w:p>
         </w:tc>
@@ -10833,7 +10317,7 @@
                 <w:rFonts w:ascii="Times New Roman" w:hAnsi="Times New Roman"/>
                 <w:sz w:val="15"/>
               </w:rPr>
-              <w:t>95.3%</w:t>
+              <w:t>94.5%</w:t>
             </w:r>
           </w:p>
         </w:tc>
@@ -10881,7 +10365,7 @@
                 <w:rFonts w:ascii="Times New Roman" w:hAnsi="Times New Roman"/>
                 <w:sz w:val="15"/>
               </w:rPr>
-              <w:t>0.9792</w:t>
+              <w:t>0.9382</w:t>
             </w:r>
           </w:p>
         </w:tc>
@@ -10905,7 +10389,7 @@
                 <w:rFonts w:ascii="Times New Roman" w:hAnsi="Times New Roman"/>
                 <w:sz w:val="15"/>
               </w:rPr>
-              <w:t>97.9%</w:t>
+              <w:t>93.8%</w:t>
             </w:r>
           </w:p>
         </w:tc>
@@ -11031,7 +10515,7 @@
           <w:rFonts w:ascii="Times New Roman" w:hAnsi="Times New Roman"/>
           <w:sz w:val="24"/>
         </w:rPr>
-        <w:t>1. Validez Ecológica: La preservación de un Micro-F1 de 0.82 en Flash 3.6 (0.81 en Flash 3.5 y 0.77 en Gemma) y precisiones del 82%–92.5% demuestra que el flujo en n8n transfiere eficazmente al lenguaje médico no estructurado real sin sobreajustar al generador sintético.</w:t>
+        <w:t>1. Validez Ecológica: La preservación de un Micro-F1 de 0.82 en Flash 3.7 (0.81 en Flash 3.5 y 0.77 en Gemma) y precisiones del 82%–92.5% demuestra que el flujo en n8n transfiere eficazmente al lenguaje médico no estructurado real sin sobreajustar al generador sintético.</w:t>
       </w:r>
     </w:p>
     <w:p>

</xml_diff>